<commit_message>
feat: refresh evidence-backed submission
</commit_message>
<xml_diff>
--- a/public/judge/Finly_Judge_Proposal.docx
+++ b/public/judge/Finly_Judge_Proposal.docx
@@ -14,7 +14,7 @@
           <w:color w:val="0D2B43"/>
           <w:sz w:val="41"/>
         </w:rPr>
-        <w:t>Finly: When a Good Backtest Should Still Not Trade</w:t>
+        <w:t>Finly: A Trading Agent That Knows What It Is Allowed to Decide</w:t>
       </w:r>
     </w:p>
     <w:p>
@@ -50,7 +50,67 @@
           <w:color w:val="263238"/>
           <w:sz w:val="19"/>
         </w:rPr>
-        <w:t xml:space="preserve">Most trading-agent designs collapse two different questions into one. The first is epistemic: can a system form a plausible view about what markets may do? The second is institutional: has that view earned authority to risk capital? Finly separates them. AI may score bounded evidence, provide a rationale, and reduce or veto a deterministic proposal. A code-owned challenge suite may remove evidence families and rerun the checks. The model does not determine direction, horizon, option structure, maximum loss, or order fields. Deterministic code owns those decisions, together with equality checks and the final </w:t>
+        <w:t xml:space="preserve">Most trading agents begin with the question, “What should I trade?” Finly begins one step earlier: which parts of that decision should an AI be allowed to control? Its answer is a division of authority rather than another promise of machine foresight. The project contains three deliberately separate objects. </w:t>
+      </w:r>
+      <w:r>
+        <w:rPr>
+          <w:rFonts w:ascii="Times New Roman" w:hAnsi="Times New Roman" w:eastAsia="Times New Roman"/>
+          <w:b/>
+          <w:i w:val="0"/>
+          <w:color w:val="263238"/>
+          <w:sz w:val="19"/>
+        </w:rPr>
+        <w:t>G4</w:t>
+      </w:r>
+      <w:r>
+        <w:rPr>
+          <w:rFonts w:ascii="Times New Roman" w:hAnsi="Times New Roman" w:eastAsia="Times New Roman"/>
+          <w:b w:val="0"/>
+          <w:i w:val="0"/>
+          <w:color w:val="263238"/>
+          <w:sz w:val="19"/>
+        </w:rPr>
+        <w:t xml:space="preserve"> is a retrospective research challenger, designed to make the strongest historical case against restraint. </w:t>
+      </w:r>
+      <w:r>
+        <w:rPr>
+          <w:rFonts w:ascii="Menlo" w:hAnsi="Menlo" w:eastAsia="Menlo"/>
+          <w:b/>
+          <w:i w:val="0"/>
+          <w:color w:val="263238"/>
+          <w:sz w:val="17"/>
+        </w:rPr>
+        <w:t>tsmom_ensemble_vol</w:t>
+      </w:r>
+      <w:r>
+        <w:rPr>
+          <w:rFonts w:ascii="Times New Roman" w:hAnsi="Times New Roman" w:eastAsia="Times New Roman"/>
+          <w:b w:val="0"/>
+          <w:i w:val="0"/>
+          <w:color w:val="263238"/>
+          <w:sz w:val="19"/>
+        </w:rPr>
+        <w:t xml:space="preserve"> is the frozen production policy, a long-only SPY/BIL allocation intended to limit risk. The </w:t>
+      </w:r>
+      <w:r>
+        <w:rPr>
+          <w:rFonts w:ascii="Times New Roman" w:hAnsi="Times New Roman" w:eastAsia="Times New Roman"/>
+          <w:b/>
+          <w:i w:val="0"/>
+          <w:color w:val="263238"/>
+          <w:sz w:val="19"/>
+        </w:rPr>
+        <w:t>options compiler</w:t>
+      </w:r>
+      <w:r>
+        <w:rPr>
+          <w:rFonts w:ascii="Times New Roman" w:hAnsi="Times New Roman" w:eastAsia="Times New Roman"/>
+          <w:b w:val="0"/>
+          <w:i w:val="0"/>
+          <w:color w:val="263238"/>
+          <w:sz w:val="19"/>
+        </w:rPr>
+        <w:t xml:space="preserve"> is neither strategy: it is the control boundary that can turn an already-permitted view into a defined-risk order intent. AI may assess bounded evidence, explain its judgment, or veto a proposal; deterministic code alone owns direction, horizon, structure, maximum loss, order fields, and the final </w:t>
       </w:r>
       <w:r>
         <w:rPr>
@@ -90,7 +150,7 @@
           <w:color w:val="263238"/>
           <w:sz w:val="19"/>
         </w:rPr>
-        <w:t xml:space="preserve"> outcome. The central claim is therefore narrower than a forecasting claim: useful judgment need not imply capital-bearing authority.</w:t>
+        <w:t xml:space="preserve"> decision. Finly's thesis is simple: useful judgment does not automatically confer authority over capital.</w:t>
       </w:r>
     </w:p>
     <w:p>
@@ -108,7 +168,47 @@
           <w:color w:val="263238"/>
           <w:sz w:val="19"/>
         </w:rPr>
-        <w:t>The strongest objection is that this division may remove the very discretion that makes an agent valuable. Momentum effects have substantial precedent [1], and volatility management shows that exposure can be adjusted systematically in response to measured risk [2]. A capable model might appear able to combine such signals with contextual evidence more flexibly than fixed rules. If the model is already being consulted, restricting it from selecting structure or exposure can look unnecessarily conservative.</w:t>
+        <w:t xml:space="preserve">G4 makes that thesis difficult rather than convenient. Every 21 sessions it assigned 50% to QQQ and divided the rest among the three strongest sector ETFs by their 252-to-126-session log return. From 2 January 2013 through 27 August 2026, its adjusted-close replay gained </w:t>
+      </w:r>
+      <w:r>
+        <w:rPr>
+          <w:rFonts w:ascii="Times New Roman" w:hAnsi="Times New Roman" w:eastAsia="Times New Roman"/>
+          <w:b/>
+          <w:i w:val="0"/>
+          <w:color w:val="263238"/>
+          <w:sz w:val="19"/>
+        </w:rPr>
+        <w:t>967.11%</w:t>
+      </w:r>
+      <w:r>
+        <w:rPr>
+          <w:rFonts w:ascii="Times New Roman" w:hAnsi="Times New Roman" w:eastAsia="Times New Roman"/>
+          <w:b w:val="0"/>
+          <w:i w:val="0"/>
+          <w:color w:val="263238"/>
+          <w:sz w:val="19"/>
+        </w:rPr>
+        <w:t xml:space="preserve">, or 18.97% annualized, against </w:t>
+      </w:r>
+      <w:r>
+        <w:rPr>
+          <w:rFonts w:ascii="Times New Roman" w:hAnsi="Times New Roman" w:eastAsia="Times New Roman"/>
+          <w:b/>
+          <w:i w:val="0"/>
+          <w:color w:val="263238"/>
+          <w:sz w:val="19"/>
+        </w:rPr>
+        <w:t>580.82%</w:t>
+      </w:r>
+      <w:r>
+        <w:rPr>
+          <w:rFonts w:ascii="Times New Roman" w:hAnsi="Times New Roman" w:eastAsia="Times New Roman"/>
+          <w:b w:val="0"/>
+          <w:i w:val="0"/>
+          <w:color w:val="263238"/>
+          <w:sz w:val="19"/>
+        </w:rPr>
+        <w:t xml:space="preserve"> and 15.11% for SPY; its maximum drawdown was -28.99% against -33.72%. Yet the result did not survive Finly's promotion standard. Its Deflated Sharpe probability was 3.75% against a 95% requirement, the worst familywise-adjusted p-value was 0.3718 against 0.05, and both the static growth-control and authenticated source-overlap gates failed [3,4,7]. The research ledger conservatively records 113 heterogeneous attempts—including controls, invalidated runs, rejected suggestions, and reruns—not 113 independent strategies. The disclosed comparator for both equity studies is SPY buy-and-hold. G4 is a post-selected adjusted-close replay; the production figures below are a consumed theoretical adjusted-OHLC next-open ledger, not broker fills, options P&amp;L, or evidence of future alpha.</w:t>
       </w:r>
     </w:p>
     <w:p>
@@ -126,7 +226,127 @@
           <w:color w:val="263238"/>
           <w:sz w:val="19"/>
         </w:rPr>
-        <w:t>That objection has force, but it moves too quickly from informational value to authorization. A model can produce an economically coherent rationale while remaining unstable, overfit, or insufficiently tested against alternatives. Historical attractiveness is not the same as permission to deploy. Finly's research record illustrates the distinction. One descriptive candidate allocated 50% to QQQ and divided the remaining 50% equally among the top three sector ETFs ranked by the log return from 252 to 126 sessions before each 21-session rebalance. Replayed from 2 January 2013 through 27 August 2026 on adjusted closes, it returned 967.11% in total, or 18.97% annualized, versus SPY at 580.82% and 15.11%. Modeled volatility was 18.01% versus 16.79%, maximum drawdown was -28.99% versus -33.72%, and annualized notional turnover was 3.78x versus 0.22x. With a five-basis-point one-way cost applied to traded notional, the sign of its historical G4-minus-SPY edge remained positive across all 21 rebalance-anchor offsets and at the tested 5, 10, and 25 basis-point cost levels.</w:t>
+        <w:t xml:space="preserve">The policy Finly actually froze is less theatrical and more useful. Every five sessions, </w:t>
+      </w:r>
+      <w:r>
+        <w:rPr>
+          <w:rFonts w:ascii="Menlo" w:hAnsi="Menlo" w:eastAsia="Menlo"/>
+          <w:b w:val="0"/>
+          <w:i w:val="0"/>
+          <w:color w:val="263238"/>
+          <w:sz w:val="17"/>
+        </w:rPr>
+        <w:t>tsmom_ensemble_vol</w:t>
+      </w:r>
+      <w:r>
+        <w:rPr>
+          <w:rFonts w:ascii="Times New Roman" w:hAnsi="Times New Roman" w:eastAsia="Times New Roman"/>
+          <w:b w:val="0"/>
+          <w:i w:val="0"/>
+          <w:color w:val="263238"/>
+          <w:sz w:val="19"/>
+        </w:rPr>
+        <w:t xml:space="preserve"> averages the signs of SPY-minus-BIL trends over 21, 63, and 252 sessions, scales the resulting SPY weight toward a 10% volatility target, and leaves the balance in BIL [1,2]. In 415 next-open observations from 2 January 2025 through 28 August 2026, signals were formed at the adjusted close and filled at the following open. Charging five basis points on each absolute SPY and BIL traded-notional leg, the policy returned </w:t>
+      </w:r>
+      <w:r>
+        <w:rPr>
+          <w:rFonts w:ascii="Times New Roman" w:hAnsi="Times New Roman" w:eastAsia="Times New Roman"/>
+          <w:b/>
+          <w:i w:val="0"/>
+          <w:color w:val="263238"/>
+          <w:sz w:val="19"/>
+        </w:rPr>
+        <w:t>+15.39%</w:t>
+      </w:r>
+      <w:r>
+        <w:rPr>
+          <w:rFonts w:ascii="Times New Roman" w:hAnsi="Times New Roman" w:eastAsia="Times New Roman"/>
+          <w:b w:val="0"/>
+          <w:i w:val="0"/>
+          <w:color w:val="263238"/>
+          <w:sz w:val="19"/>
+        </w:rPr>
+        <w:t xml:space="preserve"> with a </w:t>
+      </w:r>
+      <w:r>
+        <w:rPr>
+          <w:rFonts w:ascii="Times New Roman" w:hAnsi="Times New Roman" w:eastAsia="Times New Roman"/>
+          <w:b/>
+          <w:i w:val="0"/>
+          <w:color w:val="263238"/>
+          <w:sz w:val="19"/>
+        </w:rPr>
+        <w:t>-5.45%</w:t>
+      </w:r>
+      <w:r>
+        <w:rPr>
+          <w:rFonts w:ascii="Times New Roman" w:hAnsi="Times New Roman" w:eastAsia="Times New Roman"/>
+          <w:b w:val="0"/>
+          <w:i w:val="0"/>
+          <w:color w:val="263238"/>
+          <w:sz w:val="19"/>
+        </w:rPr>
+        <w:t xml:space="preserve"> maximum drawdown; SPY returned </w:t>
+      </w:r>
+      <w:r>
+        <w:rPr>
+          <w:rFonts w:ascii="Times New Roman" w:hAnsi="Times New Roman" w:eastAsia="Times New Roman"/>
+          <w:b/>
+          <w:i w:val="0"/>
+          <w:color w:val="263238"/>
+          <w:sz w:val="19"/>
+        </w:rPr>
+        <w:t>+33.52%</w:t>
+      </w:r>
+      <w:r>
+        <w:rPr>
+          <w:rFonts w:ascii="Times New Roman" w:hAnsi="Times New Roman" w:eastAsia="Times New Roman"/>
+          <w:b w:val="0"/>
+          <w:i w:val="0"/>
+          <w:color w:val="263238"/>
+          <w:sz w:val="19"/>
+        </w:rPr>
+        <w:t xml:space="preserve">. At a deliberately punitive 25 basis points per leg, Finly remained positive at </w:t>
+      </w:r>
+      <w:r>
+        <w:rPr>
+          <w:rFonts w:ascii="Times New Roman" w:hAnsi="Times New Roman" w:eastAsia="Times New Roman"/>
+          <w:b/>
+          <w:i w:val="0"/>
+          <w:color w:val="263238"/>
+          <w:sz w:val="19"/>
+        </w:rPr>
+        <w:t>+10.56%</w:t>
+      </w:r>
+      <w:r>
+        <w:rPr>
+          <w:rFonts w:ascii="Times New Roman" w:hAnsi="Times New Roman" w:eastAsia="Times New Roman"/>
+          <w:b w:val="0"/>
+          <w:i w:val="0"/>
+          <w:color w:val="263238"/>
+          <w:sz w:val="19"/>
+        </w:rPr>
+        <w:t xml:space="preserve">. A separate one-basis-point small-account shadow—sell-first, $1 minimum orders, nine-decimal fractional quantities, and a fee proxy—turned </w:t>
+      </w:r>
+      <w:r>
+        <w:rPr>
+          <w:rFonts w:ascii="Times New Roman" w:hAnsi="Times New Roman" w:eastAsia="Times New Roman"/>
+          <w:b/>
+          <w:i w:val="0"/>
+          <w:color w:val="263238"/>
+          <w:sz w:val="19"/>
+        </w:rPr>
+        <w:t>$300 into $351.88</w:t>
+      </w:r>
+      <w:r>
+        <w:rPr>
+          <w:rFonts w:ascii="Times New Roman" w:hAnsi="Times New Roman" w:eastAsia="Times New Roman"/>
+          <w:b w:val="0"/>
+          <w:i w:val="0"/>
+          <w:color w:val="263238"/>
+          <w:sz w:val="19"/>
+        </w:rPr>
+        <w:t xml:space="preserve"> [8]. This is not raw-return dominance. It is evidence that the production object does what it was designed to do: remain investable under friction while buying substantial drawdown protection.</w:t>
       </w:r>
     </w:p>
     <w:p>
@@ -144,7 +364,27 @@
           <w:color w:val="263238"/>
           <w:sz w:val="19"/>
         </w:rPr>
-        <w:t>Those figures are attractive, but they did not justify promotion. The candidate's Deflated Sharpe probability was 3.75% against a 95% threshold [3]; its worst adjusted familywise p-value was 0.3718 against 0.05; the static growth-control independence gate was unsupported; and the authenticated source-overlap gate did not pass. Seven later hash-frozen but fully retrospective G6 challengers were assessed, and none was selected on either the primary SPY or growth-control track. Finly conservatively counts 113 effective research attempts, although that count includes controls, rejected or unexecuted suggestions, invalidated runs, an aborted attempt, and reruns. It is not evidence of 113 independent viable strategies, but it does reinforce the need to treat apparently strong results cautiously [4].</w:t>
+        <w:t xml:space="preserve">The options layer applies the same principle at the point where mistakes become orders. A local model may supply a bounded score and rationale, but code derives the typed intent and compares every echoed field for exact equality. A shape, range, freshness, or equality failure becomes </w:t>
+      </w:r>
+      <w:r>
+        <w:rPr>
+          <w:rFonts w:ascii="Menlo" w:hAnsi="Menlo" w:eastAsia="Menlo"/>
+          <w:b w:val="0"/>
+          <w:i w:val="0"/>
+          <w:color w:val="263238"/>
+          <w:sz w:val="17"/>
+        </w:rPr>
+        <w:t>NO_TRADE</w:t>
+      </w:r>
+      <w:r>
+        <w:rPr>
+          <w:rFonts w:ascii="Times New Roman" w:hAnsi="Times New Roman" w:eastAsia="Times New Roman"/>
+          <w:b w:val="0"/>
+          <w:i w:val="0"/>
+          <w:color w:val="263238"/>
+          <w:sz w:val="19"/>
+        </w:rPr>
+        <w:t>; the model cannot enlarge loss, reverse direction, substitute a contract, or author an Alpaca payload. In the checked synthetic fixture, the compiler produced a one-contract SPY bear-put debit spread with an exact $366 maximum loss and $634 maximum gain. The challenge suite preserved direction through four source-removal tests and 32 perturbations, and an authenticated Alpaca paper-account interaction remained read-only [5,6,9]. These checks do not establish profitability. They establish something a P&amp;L chart cannot: the boundary still holds when the model disagrees, when evidence is removed, and when a broker-shaped object is within reach.</w:t>
       </w:r>
     </w:p>
     <w:p>
@@ -162,16 +402,18 @@
           <w:color w:val="263238"/>
           <w:sz w:val="19"/>
         </w:rPr>
-        <w:t>G4 is also not the policy Finly would trade. The frozen production book is a lower-risk SPY/BIL trend-and-volatility rule. In its now-consumed fixed 2025–2026 holdout, that policy returned 11.13% annualized against SPY's 19.19%, while reducing annualized volatility from 17.33% to 8.31% and maximum drawdown from -18.76% to -5.79%. It exchanged return for protection; it did not establish that Finly is more likely than not to beat SPY next month.</w:t>
+        <w:t xml:space="preserve">Attempt 114 now converts that discipline into a prospective test. Before the first signal deadline, Finly publicly froze the protocol and the full 17-file settlement-and-inference runtime; a successful GitHub workflow and </w:t>
       </w:r>
-    </w:p>
-    <w:p>
-      <w:pPr>
-        <w:keepLines w:val="0"/>
-        <w:widowControl/>
-        <w:spacing w:line="250" w:lineRule="auto" w:after="76"/>
-        <w:jc w:val="both"/>
-      </w:pPr>
+      <w:r>
+        <w:rPr>
+          <w:rFonts w:ascii="Times New Roman" w:hAnsi="Times New Roman" w:eastAsia="Times New Roman"/>
+          <w:b/>
+          <w:i w:val="0"/>
+          <w:color w:val="263238"/>
+          <w:sz w:val="19"/>
+        </w:rPr>
+        <w:t>23 unauthenticated GET checks</w:t>
+      </w:r>
       <w:r>
         <w:rPr>
           <w:rFonts w:ascii="Times New Roman" w:hAnsi="Times New Roman" w:eastAsia="Times New Roman"/>
@@ -180,16 +422,18 @@
           <w:color w:val="263238"/>
           <w:sz w:val="19"/>
         </w:rPr>
-        <w:t>The methodology also should not be described as fully preregistered. The repository records a local hash freeze of the core formula, partitions, and costs before the first G4 output, but the local timestamp is not an independent time authority. The excess-Sharpe selection rule and later inference corrections changed after the initial output, and every market interval used in the reported analysis is now consumed. That weakens any claim that the exercise constitutes a clean prospective test. The appropriate response is not to hide the limitation, but to narrow the inference drawn from it.</w:t>
+        <w:t xml:space="preserve"> re-fetched the repository, commit, workflow, jobs, manifest, and every bound source file [10,11]. The fixed sample requires </w:t>
       </w:r>
-    </w:p>
-    <w:p>
-      <w:pPr>
-        <w:keepLines w:val="0"/>
-        <w:widowControl/>
-        <w:spacing w:line="250" w:lineRule="auto" w:after="76"/>
-        <w:jc w:val="both"/>
-      </w:pPr>
+      <w:r>
+        <w:rPr>
+          <w:rFonts w:ascii="Times New Roman" w:hAnsi="Times New Roman" w:eastAsia="Times New Roman"/>
+          <w:b/>
+          <w:i w:val="0"/>
+          <w:color w:val="263238"/>
+          <w:sz w:val="19"/>
+        </w:rPr>
+        <w:t>254 consecutive pre-execution signal commitments</w:t>
+      </w:r>
       <w:r>
         <w:rPr>
           <w:rFonts w:ascii="Times New Roman" w:hAnsi="Times New Roman" w:eastAsia="Times New Roman"/>
@@ -198,16 +442,18 @@
           <w:color w:val="263238"/>
           <w:sz w:val="19"/>
         </w:rPr>
-        <w:t>The options component should be interpreted similarly. The historical ETF allocation is not an options profit-and-loss record. Finly's options contribution is the controlled compiler and defined-risk authorization boundary: deterministic code owns direction, horizon, option structure, maximum loss, order fields, equality checks, and the final decision, while AI remains confined to bounded evidentiary judgment. The locked evidence surface records a successful authenticated read-only Alpaca paper-account check; no order or fill is presented as performance evidence [5,6].</w:t>
+        <w:t xml:space="preserve"> to obtain </w:t>
       </w:r>
-    </w:p>
-    <w:p>
-      <w:pPr>
-        <w:keepLines w:val="0"/>
-        <w:widowControl/>
-        <w:spacing w:line="250" w:lineRule="auto" w:after="76"/>
-        <w:jc w:val="both"/>
-      </w:pPr>
+      <w:r>
+        <w:rPr>
+          <w:rFonts w:ascii="Times New Roman" w:hAnsi="Times New Roman" w:eastAsia="Times New Roman"/>
+          <w:b/>
+          <w:i w:val="0"/>
+          <w:color w:val="263238"/>
+          <w:sz w:val="19"/>
+        </w:rPr>
+        <w:t>252 settled returns</w:t>
+      </w:r>
       <w:r>
         <w:rPr>
           <w:rFonts w:ascii="Times New Roman" w:hAnsi="Times New Roman" w:eastAsia="Times New Roman"/>
@@ -216,7 +462,7 @@
           <w:color w:val="263238"/>
           <w:sz w:val="19"/>
         </w:rPr>
-        <w:t>Forward Trial 1 defines the next proof stage. A clean clone can verify its local zero-row state, but the record begins with no signal commitments and no settled outcomes. The protocol separates what must be fixed before a decision from what can be measured only afterward. Because a local timestamp and hash cannot prove when external data were observed, production writes, broker authority, and performance inference remain disabled until an independent pre-execution anchor exists. Finly should therefore be judged on the narrower claim it can support today: whether this division of authority is technically coherent, auditable, and actually enforced. Profit remains an empirical question for the forward record.</w:t>
+        <w:t>, with no skipping, backfill, replacement window, repeated confirmatory test, or optional stopping. The primary endpoint is the mean daily net log-return difference between the frozen production policy and SPY under the same five-basis-point cost rule. The public GitHub record verifies observed pre-deadline publication, not an independent cryptographic timestamp, provider origin, broker execution, or a performance result. That distinction is precisely the point. Finly does not ask judges to confuse a compelling backtest with knowledge. It asks them to recognize a trading agent built to know the difference—and a public protocol capable of earning the stronger claim later.</w:t>
       </w:r>
     </w:p>
     <w:p>
@@ -258,7 +504,7 @@
           <w:color w:val="68706F"/>
           <w:sz w:val="14"/>
         </w:rPr>
-        <w:t>Journal of Financial Economics</w:t>
+        <w:t>JFE</w:t>
       </w:r>
       <w:r>
         <w:rPr>
@@ -299,7 +545,7 @@
           <w:color w:val="68706F"/>
           <w:sz w:val="14"/>
         </w:rPr>
-        <w:t>Journal of Finance</w:t>
+        <w:t>JF</w:t>
       </w:r>
       <w:r>
         <w:rPr>
@@ -340,7 +586,7 @@
           <w:color w:val="68706F"/>
           <w:sz w:val="14"/>
         </w:rPr>
-        <w:t>Journal of Portfolio Management</w:t>
+        <w:t>JPM</w:t>
       </w:r>
       <w:r>
         <w:rPr>
@@ -412,7 +658,7 @@
           <w:color w:val="68706F"/>
           <w:sz w:val="14"/>
         </w:rPr>
-        <w:t xml:space="preserve">. [5] Alpaca, “Options Trading,” official documentation, </w:t>
+        <w:t xml:space="preserve">. [5] Alpaca, </w:t>
       </w:r>
       <w:hyperlink r:id="rId15">
         <w:r>
@@ -422,7 +668,7 @@
             <w:sz w:val="15"/>
             <w:u w:val="single"/>
           </w:rPr>
-          <w:t>docs.alpaca.markets</w:t>
+          <w:t>“Options Trading”</w:t>
         </w:r>
       </w:hyperlink>
       <w:r>
@@ -433,7 +679,7 @@
           <w:color w:val="68706F"/>
           <w:sz w:val="14"/>
         </w:rPr>
-        <w:t xml:space="preserve">. [6] Finly, “Submission Quantitative Evidence Surface,” 2026, claim registry: </w:t>
+        <w:t xml:space="preserve">. [6] Alpaca, </w:t>
       </w:r>
       <w:hyperlink r:id="rId16">
         <w:r>
@@ -443,7 +689,133 @@
             <w:sz w:val="15"/>
             <w:u w:val="single"/>
           </w:rPr>
-          <w:t>`public/data/submission_claims_lock.json`</w:t>
+          <w:t>“Create an Order”</w:t>
+        </w:r>
+      </w:hyperlink>
+      <w:r>
+        <w:rPr>
+          <w:rFonts w:ascii="Times New Roman" w:hAnsi="Times New Roman" w:eastAsia="Times New Roman"/>
+          <w:b w:val="0"/>
+          <w:i w:val="0"/>
+          <w:color w:val="68706F"/>
+          <w:sz w:val="14"/>
+        </w:rPr>
+        <w:t xml:space="preserve">. [7] Finly, </w:t>
+      </w:r>
+      <w:hyperlink r:id="rId17">
+        <w:r>
+          <w:rPr>
+            <w:rFonts w:ascii="Times New Roman" w:hAnsi="Times New Roman"/>
+            <w:color w:val="2E6F5C"/>
+            <w:sz w:val="15"/>
+            <w:u w:val="single"/>
+          </w:rPr>
+          <w:t>G4 robustness record</w:t>
+        </w:r>
+      </w:hyperlink>
+      <w:r>
+        <w:rPr>
+          <w:rFonts w:ascii="Times New Roman" w:hAnsi="Times New Roman" w:eastAsia="Times New Roman"/>
+          <w:b w:val="0"/>
+          <w:i w:val="0"/>
+          <w:color w:val="68706F"/>
+          <w:sz w:val="14"/>
+        </w:rPr>
+        <w:t xml:space="preserve">. [8] Finly, </w:t>
+      </w:r>
+      <w:hyperlink r:id="rId18">
+        <w:r>
+          <w:rPr>
+            <w:rFonts w:ascii="Times New Roman" w:hAnsi="Times New Roman"/>
+            <w:color w:val="2E6F5C"/>
+            <w:sz w:val="15"/>
+            <w:u w:val="single"/>
+          </w:rPr>
+          <w:t>equity execution-realism audit</w:t>
+        </w:r>
+      </w:hyperlink>
+      <w:r>
+        <w:rPr>
+          <w:rFonts w:ascii="Times New Roman" w:hAnsi="Times New Roman" w:eastAsia="Times New Roman"/>
+          <w:b w:val="0"/>
+          <w:i w:val="0"/>
+          <w:color w:val="68706F"/>
+          <w:sz w:val="14"/>
+        </w:rPr>
+        <w:t xml:space="preserve">. [9] Finly, </w:t>
+      </w:r>
+      <w:hyperlink r:id="rId19">
+        <w:r>
+          <w:rPr>
+            <w:rFonts w:ascii="Times New Roman" w:hAnsi="Times New Roman"/>
+            <w:color w:val="2E6F5C"/>
+            <w:sz w:val="15"/>
+            <w:u w:val="single"/>
+          </w:rPr>
+          <w:t>Alpaca MCP runtime audit</w:t>
+        </w:r>
+      </w:hyperlink>
+      <w:r>
+        <w:rPr>
+          <w:rFonts w:ascii="Times New Roman" w:hAnsi="Times New Roman" w:eastAsia="Times New Roman"/>
+          <w:b w:val="0"/>
+          <w:i w:val="0"/>
+          <w:color w:val="68706F"/>
+          <w:sz w:val="14"/>
+        </w:rPr>
+        <w:t xml:space="preserve">. [10] Finly, </w:t>
+      </w:r>
+      <w:hyperlink r:id="rId20">
+        <w:r>
+          <w:rPr>
+            <w:rFonts w:ascii="Times New Roman" w:hAnsi="Times New Roman"/>
+            <w:color w:val="2E6F5C"/>
+            <w:sz w:val="15"/>
+            <w:u w:val="single"/>
+          </w:rPr>
+          <w:t>Attempt 114 protocol</w:t>
+        </w:r>
+      </w:hyperlink>
+      <w:r>
+        <w:rPr>
+          <w:rFonts w:ascii="Times New Roman" w:hAnsi="Times New Roman" w:eastAsia="Times New Roman"/>
+          <w:b w:val="0"/>
+          <w:i w:val="0"/>
+          <w:color w:val="68706F"/>
+          <w:sz w:val="14"/>
+        </w:rPr>
+        <w:t xml:space="preserve"> and </w:t>
+      </w:r>
+      <w:hyperlink r:id="rId21">
+        <w:r>
+          <w:rPr>
+            <w:rFonts w:ascii="Times New Roman" w:hAnsi="Times New Roman"/>
+            <w:color w:val="2E6F5C"/>
+            <w:sz w:val="15"/>
+            <w:u w:val="single"/>
+          </w:rPr>
+          <w:t>runtime manifest</w:t>
+        </w:r>
+      </w:hyperlink>
+      <w:r>
+        <w:rPr>
+          <w:rFonts w:ascii="Times New Roman" w:hAnsi="Times New Roman" w:eastAsia="Times New Roman"/>
+          <w:b w:val="0"/>
+          <w:i w:val="0"/>
+          <w:color w:val="68706F"/>
+          <w:sz w:val="14"/>
+        </w:rPr>
+        <w:t xml:space="preserve">. [11] Finly, </w:t>
+      </w:r>
+      <w:hyperlink r:id="rId22">
+        <w:r>
+          <w:rPr>
+            <w:rFonts w:ascii="Times New Roman" w:hAnsi="Times New Roman"/>
+            <w:color w:val="2E6F5C"/>
+            <w:sz w:val="15"/>
+            <w:u w:val="single"/>
+          </w:rPr>
+          <w:t>public pre-signal publication receipt</w:t>
         </w:r>
       </w:hyperlink>
       <w:r>
@@ -665,7 +1037,7 @@
               <w:color w:val="68706F"/>
               <w:sz w:val="15"/>
             </w:rPr>
-            <w:t>29 AUGUST 2026</w:t>
+            <w:t>30 AUGUST 2026</w:t>
           </w:r>
         </w:p>
       </w:tc>

</xml_diff>

<commit_message>
release: rebuild judge-facing Finly package
</commit_message>
<xml_diff>
--- a/public/judge/Finly_Judge_Proposal.docx
+++ b/public/judge/Finly_Judge_Proposal.docx
@@ -4,42 +4,61 @@
   <w:body>
     <w:p>
       <w:pPr>
-        <w:spacing w:before="60" w:after="80"/>
+        <w:spacing w:before="0" w:after="60"/>
+        <w:jc w:val="center"/>
       </w:pPr>
       <w:r>
         <w:rPr>
           <w:rFonts w:ascii="Times New Roman" w:hAnsi="Times New Roman" w:eastAsia="Times New Roman"/>
           <w:b/>
           <w:i w:val="0"/>
-          <w:color w:val="0D2B43"/>
-          <w:sz w:val="41"/>
+          <w:color w:val="171717"/>
+          <w:sz w:val="37"/>
         </w:rPr>
-        <w:t>Finly: A Trading Agent That Knows What It Is Allowed to Decide</w:t>
+        <w:t>Finly: A Trading Agent That Knows When Not to Trade</w:t>
       </w:r>
     </w:p>
     <w:p>
       <w:pPr>
-        <w:spacing w:after="140"/>
-        <w:pBdr>
-          <w:bottom w:val="single" w:sz="9" w:space="5" w:color="2E6F5C"/>
-        </w:pBdr>
+        <w:spacing w:after="30"/>
+        <w:jc w:val="center"/>
       </w:pPr>
       <w:r>
         <w:rPr>
-          <w:rFonts w:ascii="Arial" w:hAnsi="Arial" w:eastAsia="Arial"/>
-          <w:b/>
+          <w:rFonts w:ascii="Times New Roman" w:hAnsi="Times New Roman" w:eastAsia="Times New Roman"/>
+          <w:b w:val="0"/>
           <w:i w:val="0"/>
-          <w:color w:val="68706F"/>
-          <w:sz w:val="16"/>
+          <w:color w:val="171717"/>
+          <w:sz w:val="18"/>
         </w:rPr>
         <w:t>Bruce Wen · Brandeis University · bwen412@brandeis.edu</w:t>
       </w:r>
     </w:p>
     <w:p>
       <w:pPr>
-        <w:keepLines w:val="0"/>
+        <w:spacing w:after="140"/>
+        <w:jc w:val="center"/>
+        <w:pBdr>
+          <w:bottom w:val="single" w:sz="3" w:space="4" w:color="B8BBB8"/>
+        </w:pBdr>
+      </w:pPr>
+      <w:r>
+        <w:rPr>
+          <w:rFonts w:ascii="Times New Roman" w:hAnsi="Times New Roman" w:eastAsia="Times New Roman"/>
+          <w:b w:val="0"/>
+          <w:i/>
+          <w:color w:val="5F6368"/>
+          <w:sz w:val="16"/>
+        </w:rPr>
+        <w:t>Proposal for the Alpaca AI Trading Agents Hackathon · Evidence through 30 August 2026</w:t>
+      </w:r>
+    </w:p>
+    <w:p>
+      <w:pPr>
+        <w:keepLines/>
         <w:widowControl/>
-        <w:spacing w:line="250" w:lineRule="auto" w:after="76"/>
+        <w:spacing w:line="276" w:lineRule="auto" w:after="140"/>
+        <w:ind w:firstLine="0"/>
         <w:jc w:val="both"/>
       </w:pPr>
       <w:r>
@@ -47,117 +66,18 @@
           <w:rFonts w:ascii="Times New Roman" w:hAnsi="Times New Roman" w:eastAsia="Times New Roman"/>
           <w:b w:val="0"/>
           <w:i w:val="0"/>
-          <w:color w:val="263238"/>
-          <w:sz w:val="19"/>
+          <w:color w:val="171717"/>
+          <w:sz w:val="22"/>
         </w:rPr>
-        <w:t xml:space="preserve">Most trading agents begin with the question, “What should I trade?” Finly begins one step earlier: which parts of that decision should an AI be allowed to control? Its answer is a division of authority rather than another promise of machine foresight. The project contains three deliberately separate objects. </w:t>
-      </w:r>
-      <w:r>
-        <w:rPr>
-          <w:rFonts w:ascii="Times New Roman" w:hAnsi="Times New Roman" w:eastAsia="Times New Roman"/>
-          <w:b/>
-          <w:i w:val="0"/>
-          <w:color w:val="263238"/>
-          <w:sz w:val="19"/>
-        </w:rPr>
-        <w:t>G4</w:t>
-      </w:r>
-      <w:r>
-        <w:rPr>
-          <w:rFonts w:ascii="Times New Roman" w:hAnsi="Times New Roman" w:eastAsia="Times New Roman"/>
-          <w:b w:val="0"/>
-          <w:i w:val="0"/>
-          <w:color w:val="263238"/>
-          <w:sz w:val="19"/>
-        </w:rPr>
-        <w:t xml:space="preserve"> is a retrospective research challenger, designed to make the strongest historical case against restraint. </w:t>
-      </w:r>
-      <w:r>
-        <w:rPr>
-          <w:rFonts w:ascii="Menlo" w:hAnsi="Menlo" w:eastAsia="Menlo"/>
-          <w:b/>
-          <w:i w:val="0"/>
-          <w:color w:val="263238"/>
-          <w:sz w:val="17"/>
-        </w:rPr>
-        <w:t>tsmom_ensemble_vol</w:t>
-      </w:r>
-      <w:r>
-        <w:rPr>
-          <w:rFonts w:ascii="Times New Roman" w:hAnsi="Times New Roman" w:eastAsia="Times New Roman"/>
-          <w:b w:val="0"/>
-          <w:i w:val="0"/>
-          <w:color w:val="263238"/>
-          <w:sz w:val="19"/>
-        </w:rPr>
-        <w:t xml:space="preserve"> is the frozen production policy, a long-only SPY/BIL allocation intended to limit risk. The </w:t>
-      </w:r>
-      <w:r>
-        <w:rPr>
-          <w:rFonts w:ascii="Times New Roman" w:hAnsi="Times New Roman" w:eastAsia="Times New Roman"/>
-          <w:b/>
-          <w:i w:val="0"/>
-          <w:color w:val="263238"/>
-          <w:sz w:val="19"/>
-        </w:rPr>
-        <w:t>options compiler</w:t>
-      </w:r>
-      <w:r>
-        <w:rPr>
-          <w:rFonts w:ascii="Times New Roman" w:hAnsi="Times New Roman" w:eastAsia="Times New Roman"/>
-          <w:b w:val="0"/>
-          <w:i w:val="0"/>
-          <w:color w:val="263238"/>
-          <w:sz w:val="19"/>
-        </w:rPr>
-        <w:t xml:space="preserve"> is neither strategy: it is the control boundary that can turn an already-permitted view into a defined-risk order intent. AI may assess bounded evidence, explain its judgment, or veto a proposal; deterministic code alone owns direction, horizon, structure, maximum loss, order fields, and the final </w:t>
-      </w:r>
-      <w:r>
-        <w:rPr>
-          <w:rFonts w:ascii="Menlo" w:hAnsi="Menlo" w:eastAsia="Menlo"/>
-          <w:b w:val="0"/>
-          <w:i w:val="0"/>
-          <w:color w:val="263238"/>
-          <w:sz w:val="17"/>
-        </w:rPr>
-        <w:t>PERMIT</w:t>
-      </w:r>
-      <w:r>
-        <w:rPr>
-          <w:rFonts w:ascii="Times New Roman" w:hAnsi="Times New Roman" w:eastAsia="Times New Roman"/>
-          <w:b w:val="0"/>
-          <w:i w:val="0"/>
-          <w:color w:val="263238"/>
-          <w:sz w:val="19"/>
-        </w:rPr>
-        <w:t xml:space="preserve"> or </w:t>
-      </w:r>
-      <w:r>
-        <w:rPr>
-          <w:rFonts w:ascii="Menlo" w:hAnsi="Menlo" w:eastAsia="Menlo"/>
-          <w:b w:val="0"/>
-          <w:i w:val="0"/>
-          <w:color w:val="263238"/>
-          <w:sz w:val="17"/>
-        </w:rPr>
-        <w:t>NO_TRADE</w:t>
-      </w:r>
-      <w:r>
-        <w:rPr>
-          <w:rFonts w:ascii="Times New Roman" w:hAnsi="Times New Roman" w:eastAsia="Times New Roman"/>
-          <w:b w:val="0"/>
-          <w:i w:val="0"/>
-          <w:color w:val="263238"/>
-          <w:sz w:val="19"/>
-        </w:rPr>
-        <w:t xml:space="preserve"> decision. Finly's thesis is simple: useful judgment does not automatically confer authority over capital.</w:t>
+        <w:t>What should an AI trading agent be allowed to decide? The obvious answer is that a capable model should read more evidence, form a better view, and place the corresponding trade. Finly begins from the opposite concern. In markets, a persuasive explanation and an authorized exposure are different things: one can be evaluated in words; the other can lose capital before anyone has resolved whether the explanation was sound. Finly therefore gives AI a serious but limited role. A model may interpret a bounded evidence bundle, state its reasons, and veto a proposed action. Deterministic code retains the decisions that directly create risk: market direction, horizon, structure, order fields, maximum loss, and the final choice between permission and no trade. The proposal is not to make the model decorative. It is to make its authority proportionate to the evidence. That division makes the demo inspectable. A judge can follow a source from ingestion to interpretation, compare the model's typed response with the code-owned intent, and see why disagreement removes permission rather than being smoothed into a more confident order. The resulting record identifies which judgment failed and who still owned the risk.</w:t>
       </w:r>
     </w:p>
     <w:p>
       <w:pPr>
-        <w:keepLines w:val="0"/>
+        <w:keepLines/>
         <w:widowControl/>
-        <w:spacing w:line="250" w:lineRule="auto" w:after="76"/>
+        <w:spacing w:line="276" w:lineRule="auto" w:after="140"/>
+        <w:ind w:firstLine="302"/>
         <w:jc w:val="both"/>
       </w:pPr>
       <w:r>
@@ -165,57 +85,18 @@
           <w:rFonts w:ascii="Times New Roman" w:hAnsi="Times New Roman" w:eastAsia="Times New Roman"/>
           <w:b w:val="0"/>
           <w:i w:val="0"/>
-          <w:color w:val="263238"/>
-          <w:sz w:val="19"/>
+          <w:color w:val="171717"/>
+          <w:sz w:val="22"/>
         </w:rPr>
-        <w:t xml:space="preserve">G4 makes that thesis difficult rather than convenient. Every 21 sessions it assigned 50% to QQQ and divided the rest among the three strongest sector ETFs by their 252-to-126-session log return. From 2 January 2013 through 27 August 2026, its adjusted-close replay gained </w:t>
-      </w:r>
-      <w:r>
-        <w:rPr>
-          <w:rFonts w:ascii="Times New Roman" w:hAnsi="Times New Roman" w:eastAsia="Times New Roman"/>
-          <w:b/>
-          <w:i w:val="0"/>
-          <w:color w:val="263238"/>
-          <w:sz w:val="19"/>
-        </w:rPr>
-        <w:t>967.11%</w:t>
-      </w:r>
-      <w:r>
-        <w:rPr>
-          <w:rFonts w:ascii="Times New Roman" w:hAnsi="Times New Roman" w:eastAsia="Times New Roman"/>
-          <w:b w:val="0"/>
-          <w:i w:val="0"/>
-          <w:color w:val="263238"/>
-          <w:sz w:val="19"/>
-        </w:rPr>
-        <w:t xml:space="preserve">, or 18.97% annualized, against </w:t>
-      </w:r>
-      <w:r>
-        <w:rPr>
-          <w:rFonts w:ascii="Times New Roman" w:hAnsi="Times New Roman" w:eastAsia="Times New Roman"/>
-          <w:b/>
-          <w:i w:val="0"/>
-          <w:color w:val="263238"/>
-          <w:sz w:val="19"/>
-        </w:rPr>
-        <w:t>580.82%</w:t>
-      </w:r>
-      <w:r>
-        <w:rPr>
-          <w:rFonts w:ascii="Times New Roman" w:hAnsi="Times New Roman" w:eastAsia="Times New Roman"/>
-          <w:b w:val="0"/>
-          <w:i w:val="0"/>
-          <w:color w:val="263238"/>
-          <w:sz w:val="19"/>
-        </w:rPr>
-        <w:t xml:space="preserve"> and 15.11% for SPY; its maximum drawdown was -28.99% against -33.72%. Yet the result did not survive Finly's promotion standard. Its Deflated Sharpe probability was 3.75% against a 95% requirement, the worst familywise-adjusted p-value was 0.3718 against 0.05, and both the static growth-control and authenticated source-overlap gates failed [3,4,7]. The research ledger conservatively records 113 heterogeneous attempts—including controls, invalidated runs, rejected suggestions, and reruns—not 113 independent strategies. The disclosed comparator for both equity studies is SPY buy-and-hold. G4 is a post-selected adjusted-close replay; the production figures below are a consumed theoretical adjusted-OHLC next-open ledger, not broker fills, options P&amp;L, or evidence of future alpha.</w:t>
+        <w:t>The project tests this boundary against its own strongest temptation. In the consumed, post-selected 2013-01-02–2026-08-27 retrospective replay with modeled 5 bp one-way costs, G4 returned +967.11% versus SPY +580.82%; promotion was rejected because the Deflated Sharpe probability was 3.75% and the worst familywise-adjusted p-value was 37.18%. That is the result a conventional pitch would enlarge and leave unexplained. Finly instead keeps the rejection beside the return. G4 is not the production policy and not evidence of future market superiority [3–5]. The refusal matters because a backtest is most dangerous when it is attractive enough to silence the question of how it was found.</w:t>
       </w:r>
     </w:p>
     <w:p>
       <w:pPr>
-        <w:keepLines w:val="0"/>
+        <w:keepLines/>
         <w:widowControl/>
-        <w:spacing w:line="250" w:lineRule="auto" w:after="76"/>
+        <w:spacing w:line="276" w:lineRule="auto" w:after="140"/>
+        <w:ind w:firstLine="302"/>
         <w:jc w:val="both"/>
       </w:pPr>
       <w:r>
@@ -223,137 +104,18 @@
           <w:rFonts w:ascii="Times New Roman" w:hAnsi="Times New Roman" w:eastAsia="Times New Roman"/>
           <w:b w:val="0"/>
           <w:i w:val="0"/>
-          <w:color w:val="263238"/>
-          <w:sz w:val="19"/>
+          <w:color w:val="171717"/>
+          <w:sz w:val="22"/>
         </w:rPr>
-        <w:t xml:space="preserve">The policy Finly actually froze is less theatrical and more useful. Every five sessions, </w:t>
-      </w:r>
-      <w:r>
-        <w:rPr>
-          <w:rFonts w:ascii="Menlo" w:hAnsi="Menlo" w:eastAsia="Menlo"/>
-          <w:b w:val="0"/>
-          <w:i w:val="0"/>
-          <w:color w:val="263238"/>
-          <w:sz w:val="17"/>
-        </w:rPr>
-        <w:t>tsmom_ensemble_vol</w:t>
-      </w:r>
-      <w:r>
-        <w:rPr>
-          <w:rFonts w:ascii="Times New Roman" w:hAnsi="Times New Roman" w:eastAsia="Times New Roman"/>
-          <w:b w:val="0"/>
-          <w:i w:val="0"/>
-          <w:color w:val="263238"/>
-          <w:sz w:val="19"/>
-        </w:rPr>
-        <w:t xml:space="preserve"> averages the signs of SPY-minus-BIL trends over 21, 63, and 252 sessions, scales the resulting SPY weight toward a 10% volatility target, and leaves the balance in BIL [1,2]. In 415 next-open observations from 2 January 2025 through 28 August 2026, signals were formed at the adjusted close and filled at the following open. Charging five basis points on each absolute SPY and BIL traded-notional leg, the policy returned </w:t>
-      </w:r>
-      <w:r>
-        <w:rPr>
-          <w:rFonts w:ascii="Times New Roman" w:hAnsi="Times New Roman" w:eastAsia="Times New Roman"/>
-          <w:b/>
-          <w:i w:val="0"/>
-          <w:color w:val="263238"/>
-          <w:sz w:val="19"/>
-        </w:rPr>
-        <w:t>+15.39%</w:t>
-      </w:r>
-      <w:r>
-        <w:rPr>
-          <w:rFonts w:ascii="Times New Roman" w:hAnsi="Times New Roman" w:eastAsia="Times New Roman"/>
-          <w:b w:val="0"/>
-          <w:i w:val="0"/>
-          <w:color w:val="263238"/>
-          <w:sz w:val="19"/>
-        </w:rPr>
-        <w:t xml:space="preserve"> with a </w:t>
-      </w:r>
-      <w:r>
-        <w:rPr>
-          <w:rFonts w:ascii="Times New Roman" w:hAnsi="Times New Roman" w:eastAsia="Times New Roman"/>
-          <w:b/>
-          <w:i w:val="0"/>
-          <w:color w:val="263238"/>
-          <w:sz w:val="19"/>
-        </w:rPr>
-        <w:t>-5.45%</w:t>
-      </w:r>
-      <w:r>
-        <w:rPr>
-          <w:rFonts w:ascii="Times New Roman" w:hAnsi="Times New Roman" w:eastAsia="Times New Roman"/>
-          <w:b w:val="0"/>
-          <w:i w:val="0"/>
-          <w:color w:val="263238"/>
-          <w:sz w:val="19"/>
-        </w:rPr>
-        <w:t xml:space="preserve"> maximum drawdown; SPY returned </w:t>
-      </w:r>
-      <w:r>
-        <w:rPr>
-          <w:rFonts w:ascii="Times New Roman" w:hAnsi="Times New Roman" w:eastAsia="Times New Roman"/>
-          <w:b/>
-          <w:i w:val="0"/>
-          <w:color w:val="263238"/>
-          <w:sz w:val="19"/>
-        </w:rPr>
-        <w:t>+33.52%</w:t>
-      </w:r>
-      <w:r>
-        <w:rPr>
-          <w:rFonts w:ascii="Times New Roman" w:hAnsi="Times New Roman" w:eastAsia="Times New Roman"/>
-          <w:b w:val="0"/>
-          <w:i w:val="0"/>
-          <w:color w:val="263238"/>
-          <w:sz w:val="19"/>
-        </w:rPr>
-        <w:t xml:space="preserve">. At a deliberately punitive 25 basis points per leg, Finly remained positive at </w:t>
-      </w:r>
-      <w:r>
-        <w:rPr>
-          <w:rFonts w:ascii="Times New Roman" w:hAnsi="Times New Roman" w:eastAsia="Times New Roman"/>
-          <w:b/>
-          <w:i w:val="0"/>
-          <w:color w:val="263238"/>
-          <w:sz w:val="19"/>
-        </w:rPr>
-        <w:t>+10.56%</w:t>
-      </w:r>
-      <w:r>
-        <w:rPr>
-          <w:rFonts w:ascii="Times New Roman" w:hAnsi="Times New Roman" w:eastAsia="Times New Roman"/>
-          <w:b w:val="0"/>
-          <w:i w:val="0"/>
-          <w:color w:val="263238"/>
-          <w:sz w:val="19"/>
-        </w:rPr>
-        <w:t xml:space="preserve">. A separate one-basis-point small-account shadow—sell-first, $1 minimum orders, nine-decimal fractional quantities, and a fee proxy—turned </w:t>
-      </w:r>
-      <w:r>
-        <w:rPr>
-          <w:rFonts w:ascii="Times New Roman" w:hAnsi="Times New Roman" w:eastAsia="Times New Roman"/>
-          <w:b/>
-          <w:i w:val="0"/>
-          <w:color w:val="263238"/>
-          <w:sz w:val="19"/>
-        </w:rPr>
-        <w:t>$300 into $351.88</w:t>
-      </w:r>
-      <w:r>
-        <w:rPr>
-          <w:rFonts w:ascii="Times New Roman" w:hAnsi="Times New Roman" w:eastAsia="Times New Roman"/>
-          <w:b w:val="0"/>
-          <w:i w:val="0"/>
-          <w:color w:val="263238"/>
-          <w:sz w:val="19"/>
-        </w:rPr>
-        <w:t xml:space="preserve"> [8]. This is not raw-return dominance. It is evidence that the production object does what it was designed to do: remain investable under friction while buying substantial drawdown protection.</w:t>
+        <w:t>The frozen production policy makes a smaller claim. Production v1 is the frozen unlevered SPY/BIL policy targeting 10% annualized volatility: in the consumed 2025-01-02–2026-08-28 modeled next-open study it returned +15.39% at 5 bp per traded leg and +10.56% at 25 bp, versus SPY +33.52%; at 5 bp its modeled annualized volatility was 8.12% and maximum drawdown was -5.45%, so it was risk-controlled but not market-beating on total return. The study is a theoretical adjusted-OHLC ledger, not broker fills or options profit and loss [1,2,5]. This distinction turns an apparent weakness into useful information. Judges can see what the policy bought, what it surrendered, and what remains unproved.</w:t>
       </w:r>
     </w:p>
     <w:p>
       <w:pPr>
-        <w:keepLines w:val="0"/>
+        <w:keepLines/>
         <w:widowControl/>
-        <w:spacing w:line="250" w:lineRule="auto" w:after="76"/>
+        <w:spacing w:line="276" w:lineRule="auto" w:after="140"/>
+        <w:ind w:firstLine="302"/>
         <w:jc w:val="both"/>
       </w:pPr>
       <w:r>
@@ -361,37 +123,34 @@
           <w:rFonts w:ascii="Times New Roman" w:hAnsi="Times New Roman" w:eastAsia="Times New Roman"/>
           <w:b w:val="0"/>
           <w:i w:val="0"/>
-          <w:color w:val="263238"/>
-          <w:sz w:val="19"/>
+          <w:color w:val="171717"/>
+          <w:sz w:val="22"/>
         </w:rPr>
-        <w:t xml:space="preserve">The options layer applies the same principle at the point where mistakes become orders. A local model may supply a bounded score and rationale, but code derives the typed intent and compares every echoed field for exact equality. A shape, range, freshness, or equality failure becomes </w:t>
+        <w:t>Finly's final step is prospective rather than rhetorical. Attempts 115 and 116 are publicly registered future-only tests. As of 2026-08-30T08:10:52.000Z, each had zero observed outcomes, and neither supports a performance claim. [6,7] That empty record is intentional: it prevents a favorable history from being relabeled as a forward test. At the Generation 7 capture, 20 projects were visible and zero supplied an exact same-panel submitted-options comparator; missing P&amp;L is unknown, never zero, and supports neither a return matchup nor a competitor rank. [5] Finly should therefore be judged on what it presently demonstrates: a working separation between interpretation and authorization, a research process capable of rejecting its best-looking historical survivor, a frozen policy described without disguising its tradeoff, and a public experiment that can earn a stronger claim later. The governing principle is modest but consequential: when capital is at risk, intelligence should widen inquiry before it widens authority.</w:t>
       </w:r>
-      <w:r>
-        <w:rPr>
-          <w:rFonts w:ascii="Menlo" w:hAnsi="Menlo" w:eastAsia="Menlo"/>
-          <w:b w:val="0"/>
-          <w:i w:val="0"/>
-          <w:color w:val="263238"/>
-          <w:sz w:val="17"/>
-        </w:rPr>
-        <w:t>NO_TRADE</w:t>
-      </w:r>
+    </w:p>
+    <w:p>
+      <w:pPr>
+        <w:keepNext/>
+        <w:spacing w:before="20" w:after="40"/>
+      </w:pPr>
       <w:r>
         <w:rPr>
           <w:rFonts w:ascii="Times New Roman" w:hAnsi="Times New Roman" w:eastAsia="Times New Roman"/>
-          <w:b w:val="0"/>
+          <w:b/>
           <w:i w:val="0"/>
-          <w:color w:val="263238"/>
-          <w:sz w:val="19"/>
+          <w:color w:val="171717"/>
+          <w:sz w:val="17"/>
         </w:rPr>
-        <w:t>; the model cannot enlarge loss, reverse direction, substitute a contract, or author an Alpaca payload. In the checked synthetic fixture, the compiler produced a one-contract SPY bear-put debit spread with an exact $366 maximum loss and $634 maximum gain. The challenge suite preserved direction through four source-removal tests and 32 perturbations, and an authenticated Alpaca paper-account interaction remained read-only [5,6,9]. These checks do not establish profitability. They establish something a P&amp;L chart cannot: the boundary still holds when the model disagrees, when evidence is removed, and when a broker-shaped object is within reach.</w:t>
+        <w:t>References</w:t>
       </w:r>
     </w:p>
     <w:p>
       <w:pPr>
         <w:keepLines w:val="0"/>
         <w:widowControl/>
-        <w:spacing w:line="250" w:lineRule="auto" w:after="76"/>
+        <w:spacing w:line="240" w:lineRule="auto" w:after="0"/>
+        <w:ind w:left="202" w:hanging="202"/>
         <w:jc w:val="both"/>
       </w:pPr>
       <w:r>
@@ -399,128 +158,36 @@
           <w:rFonts w:ascii="Times New Roman" w:hAnsi="Times New Roman" w:eastAsia="Times New Roman"/>
           <w:b w:val="0"/>
           <w:i w:val="0"/>
-          <w:color w:val="263238"/>
-          <w:sz w:val="19"/>
+          <w:color w:val="5F6368"/>
+          <w:sz w:val="15"/>
         </w:rPr>
-        <w:t xml:space="preserve">Attempt 114 now converts that discipline into a prospective test. Before the first signal deadline, Finly publicly froze the protocol and the full 17-file settlement-and-inference runtime; a successful GitHub workflow and </w:t>
+        <w:t xml:space="preserve">[1] T. J. Moskowitz, Y. H. Ooi, and L. H. Pedersen, “Time Series Momentum,” </w:t>
       </w:r>
       <w:r>
         <w:rPr>
           <w:rFonts w:ascii="Times New Roman" w:hAnsi="Times New Roman" w:eastAsia="Times New Roman"/>
-          <w:b/>
-          <w:i w:val="0"/>
-          <w:color w:val="263238"/>
-          <w:sz w:val="19"/>
+          <w:b w:val="0"/>
+          <w:i/>
+          <w:color w:val="5F6368"/>
+          <w:sz w:val="15"/>
         </w:rPr>
-        <w:t>23 unauthenticated GET checks</w:t>
+        <w:t>Journal of Financial Economics</w:t>
       </w:r>
       <w:r>
         <w:rPr>
           <w:rFonts w:ascii="Times New Roman" w:hAnsi="Times New Roman" w:eastAsia="Times New Roman"/>
           <w:b w:val="0"/>
           <w:i w:val="0"/>
-          <w:color w:val="263238"/>
-          <w:sz w:val="19"/>
+          <w:color w:val="5F6368"/>
+          <w:sz w:val="15"/>
         </w:rPr>
-        <w:t xml:space="preserve"> re-fetched the repository, commit, workflow, jobs, manifest, and every bound source file [10,11]. The fixed sample requires </w:t>
+        <w:t xml:space="preserve"> 104 (2012), 228–250, </w:t>
       </w:r>
-      <w:r>
-        <w:rPr>
-          <w:rFonts w:ascii="Times New Roman" w:hAnsi="Times New Roman" w:eastAsia="Times New Roman"/>
-          <w:b/>
-          <w:i w:val="0"/>
-          <w:color w:val="263238"/>
-          <w:sz w:val="19"/>
-        </w:rPr>
-        <w:t>254 consecutive pre-execution signal commitments</w:t>
-      </w:r>
-      <w:r>
-        <w:rPr>
-          <w:rFonts w:ascii="Times New Roman" w:hAnsi="Times New Roman" w:eastAsia="Times New Roman"/>
-          <w:b w:val="0"/>
-          <w:i w:val="0"/>
-          <w:color w:val="263238"/>
-          <w:sz w:val="19"/>
-        </w:rPr>
-        <w:t xml:space="preserve"> to obtain </w:t>
-      </w:r>
-      <w:r>
-        <w:rPr>
-          <w:rFonts w:ascii="Times New Roman" w:hAnsi="Times New Roman" w:eastAsia="Times New Roman"/>
-          <w:b/>
-          <w:i w:val="0"/>
-          <w:color w:val="263238"/>
-          <w:sz w:val="19"/>
-        </w:rPr>
-        <w:t>252 settled returns</w:t>
-      </w:r>
-      <w:r>
-        <w:rPr>
-          <w:rFonts w:ascii="Times New Roman" w:hAnsi="Times New Roman" w:eastAsia="Times New Roman"/>
-          <w:b w:val="0"/>
-          <w:i w:val="0"/>
-          <w:color w:val="263238"/>
-          <w:sz w:val="19"/>
-        </w:rPr>
-        <w:t>, with no skipping, backfill, replacement window, repeated confirmatory test, or optional stopping. The primary endpoint is the mean daily net log-return difference between the frozen production policy and SPY under the same five-basis-point cost rule. The public GitHub record verifies observed pre-deadline publication, not an independent cryptographic timestamp, provider origin, broker execution, or a performance result. That distinction is precisely the point. Finly does not ask judges to confuse a compelling backtest with knowledge. It asks them to recognize a trading agent built to know the difference—and a public protocol capable of earning the stronger claim later.</w:t>
-      </w:r>
-    </w:p>
-    <w:p>
-      <w:pPr>
-        <w:keepLines w:val="0"/>
-        <w:widowControl/>
-        <w:spacing w:line="240" w:lineRule="auto" w:after="0" w:before="40"/>
-        <w:ind w:left="259" w:hanging="259"/>
-        <w:jc w:val="both"/>
-        <w:pBdr>
-          <w:bottom w:val="single" w:sz="4" w:space="4" w:color="C8CCC7"/>
-        </w:pBdr>
-      </w:pPr>
-      <w:r>
-        <w:rPr>
-          <w:rFonts w:ascii="Times New Roman" w:hAnsi="Times New Roman" w:eastAsia="Times New Roman"/>
-          <w:b/>
-          <w:i w:val="0"/>
-          <w:color w:val="68706F"/>
-          <w:sz w:val="14"/>
-        </w:rPr>
-        <w:t>References.</w:t>
-      </w:r>
-      <w:r>
-        <w:rPr>
-          <w:rFonts w:ascii="Times New Roman" w:hAnsi="Times New Roman" w:eastAsia="Times New Roman"/>
-          <w:b w:val="0"/>
-          <w:i w:val="0"/>
-          <w:color w:val="68706F"/>
-          <w:sz w:val="14"/>
-        </w:rPr>
-        <w:t xml:space="preserve"> [1] Moskowitz, Ooi, and Pedersen, “Time Series Momentum,” </w:t>
-      </w:r>
-      <w:r>
-        <w:rPr>
-          <w:rFonts w:ascii="Times New Roman" w:hAnsi="Times New Roman" w:eastAsia="Times New Roman"/>
-          <w:b w:val="0"/>
-          <w:i/>
-          <w:color w:val="68706F"/>
-          <w:sz w:val="14"/>
-        </w:rPr>
-        <w:t>JFE</w:t>
-      </w:r>
-      <w:r>
-        <w:rPr>
-          <w:rFonts w:ascii="Times New Roman" w:hAnsi="Times New Roman" w:eastAsia="Times New Roman"/>
-          <w:b w:val="0"/>
-          <w:i w:val="0"/>
-          <w:color w:val="68706F"/>
-          <w:sz w:val="14"/>
-        </w:rPr>
-        <w:t xml:space="preserve"> 104(2), 2012, </w:t>
-      </w:r>
-      <w:hyperlink r:id="rId11">
+      <w:hyperlink r:id="rId10">
         <w:r>
           <w:rPr>
             <w:rFonts w:ascii="Times New Roman" w:hAnsi="Times New Roman"/>
-            <w:color w:val="2E6F5C"/>
+            <w:color w:val="1F5A4C"/>
             <w:sz w:val="15"/>
             <w:u w:val="single"/>
           </w:rPr>
@@ -532,36 +199,36 @@
           <w:rFonts w:ascii="Times New Roman" w:hAnsi="Times New Roman" w:eastAsia="Times New Roman"/>
           <w:b w:val="0"/>
           <w:i w:val="0"/>
-          <w:color w:val="68706F"/>
-          <w:sz w:val="14"/>
+          <w:color w:val="5F6368"/>
+          <w:sz w:val="15"/>
         </w:rPr>
-        <w:t xml:space="preserve">. [2] Moreira and Muir, “Volatility-Managed Portfolios,” </w:t>
+        <w:t xml:space="preserve">. [2] A. Moreira and T. Muir, “Volatility-Managed Portfolios,” </w:t>
       </w:r>
       <w:r>
         <w:rPr>
           <w:rFonts w:ascii="Times New Roman" w:hAnsi="Times New Roman" w:eastAsia="Times New Roman"/>
           <w:b w:val="0"/>
           <w:i/>
-          <w:color w:val="68706F"/>
-          <w:sz w:val="14"/>
+          <w:color w:val="5F6368"/>
+          <w:sz w:val="15"/>
         </w:rPr>
-        <w:t>JF</w:t>
+        <w:t>Journal of Finance</w:t>
       </w:r>
       <w:r>
         <w:rPr>
           <w:rFonts w:ascii="Times New Roman" w:hAnsi="Times New Roman" w:eastAsia="Times New Roman"/>
           <w:b w:val="0"/>
           <w:i w:val="0"/>
-          <w:color w:val="68706F"/>
-          <w:sz w:val="14"/>
+          <w:color w:val="5F6368"/>
+          <w:sz w:val="15"/>
         </w:rPr>
-        <w:t xml:space="preserve"> 72(4), 2017, </w:t>
+        <w:t xml:space="preserve"> 72 (2017), 1611–1644, </w:t>
       </w:r>
-      <w:hyperlink r:id="rId12">
+      <w:hyperlink r:id="rId11">
         <w:r>
           <w:rPr>
             <w:rFonts w:ascii="Times New Roman" w:hAnsi="Times New Roman"/>
-            <w:color w:val="2E6F5C"/>
+            <w:color w:val="1F5A4C"/>
             <w:sz w:val="15"/>
             <w:u w:val="single"/>
           </w:rPr>
@@ -573,36 +240,77 @@
           <w:rFonts w:ascii="Times New Roman" w:hAnsi="Times New Roman" w:eastAsia="Times New Roman"/>
           <w:b w:val="0"/>
           <w:i w:val="0"/>
-          <w:color w:val="68706F"/>
-          <w:sz w:val="14"/>
+          <w:color w:val="5F6368"/>
+          <w:sz w:val="15"/>
         </w:rPr>
-        <w:t xml:space="preserve">. [3] Bailey and López de Prado, “The Deflated Sharpe Ratio,” </w:t>
+        <w:t xml:space="preserve">. [3] H. White, “A Reality Check for Data Snooping,” </w:t>
       </w:r>
       <w:r>
         <w:rPr>
           <w:rFonts w:ascii="Times New Roman" w:hAnsi="Times New Roman" w:eastAsia="Times New Roman"/>
           <w:b w:val="0"/>
           <w:i/>
-          <w:color w:val="68706F"/>
-          <w:sz w:val="14"/>
+          <w:color w:val="5F6368"/>
+          <w:sz w:val="15"/>
         </w:rPr>
-        <w:t>JPM</w:t>
+        <w:t>Econometrica</w:t>
       </w:r>
       <w:r>
         <w:rPr>
           <w:rFonts w:ascii="Times New Roman" w:hAnsi="Times New Roman" w:eastAsia="Times New Roman"/>
           <w:b w:val="0"/>
           <w:i w:val="0"/>
-          <w:color w:val="68706F"/>
-          <w:sz w:val="14"/>
+          <w:color w:val="5F6368"/>
+          <w:sz w:val="15"/>
         </w:rPr>
-        <w:t xml:space="preserve"> 40(5), 2014, </w:t>
+        <w:t xml:space="preserve"> 68 (2000), 1097–1126, </w:t>
+      </w:r>
+      <w:hyperlink r:id="rId12">
+        <w:r>
+          <w:rPr>
+            <w:rFonts w:ascii="Times New Roman" w:hAnsi="Times New Roman"/>
+            <w:color w:val="1F5A4C"/>
+            <w:sz w:val="15"/>
+            <w:u w:val="single"/>
+          </w:rPr>
+          <w:t>doi:10.1111/1468-0262.00152</w:t>
+        </w:r>
+      </w:hyperlink>
+      <w:r>
+        <w:rPr>
+          <w:rFonts w:ascii="Times New Roman" w:hAnsi="Times New Roman" w:eastAsia="Times New Roman"/>
+          <w:b w:val="0"/>
+          <w:i w:val="0"/>
+          <w:color w:val="5F6368"/>
+          <w:sz w:val="15"/>
+        </w:rPr>
+        <w:t xml:space="preserve">. [4] D. H. Bailey and M. López de Prado, “The Deflated Sharpe Ratio,” </w:t>
+      </w:r>
+      <w:r>
+        <w:rPr>
+          <w:rFonts w:ascii="Times New Roman" w:hAnsi="Times New Roman" w:eastAsia="Times New Roman"/>
+          <w:b w:val="0"/>
+          <w:i/>
+          <w:color w:val="5F6368"/>
+          <w:sz w:val="15"/>
+        </w:rPr>
+        <w:t>Journal of Portfolio Management</w:t>
+      </w:r>
+      <w:r>
+        <w:rPr>
+          <w:rFonts w:ascii="Times New Roman" w:hAnsi="Times New Roman" w:eastAsia="Times New Roman"/>
+          <w:b w:val="0"/>
+          <w:i w:val="0"/>
+          <w:color w:val="5F6368"/>
+          <w:sz w:val="15"/>
+        </w:rPr>
+        <w:t xml:space="preserve"> 40 (2014), 94–107, </w:t>
       </w:r>
       <w:hyperlink r:id="rId13">
         <w:r>
           <w:rPr>
             <w:rFonts w:ascii="Times New Roman" w:hAnsi="Times New Roman"/>
-            <w:color w:val="2E6F5C"/>
+            <w:color w:val="1F5A4C"/>
             <w:sz w:val="15"/>
             <w:u w:val="single"/>
           </w:rPr>
@@ -614,40 +322,20 @@
           <w:rFonts w:ascii="Times New Roman" w:hAnsi="Times New Roman" w:eastAsia="Times New Roman"/>
           <w:b w:val="0"/>
           <w:i w:val="0"/>
-          <w:color w:val="68706F"/>
-          <w:sz w:val="14"/>
+          <w:color w:val="5F6368"/>
+          <w:sz w:val="15"/>
         </w:rPr>
-        <w:t xml:space="preserve">. [4] White, “A Reality Check for Data Snooping,” </w:t>
-      </w:r>
-      <w:r>
-        <w:rPr>
-          <w:rFonts w:ascii="Times New Roman" w:hAnsi="Times New Roman" w:eastAsia="Times New Roman"/>
-          <w:b w:val="0"/>
-          <w:i/>
-          <w:color w:val="68706F"/>
-          <w:sz w:val="14"/>
-        </w:rPr>
-        <w:t>Econometrica</w:t>
-      </w:r>
-      <w:r>
-        <w:rPr>
-          <w:rFonts w:ascii="Times New Roman" w:hAnsi="Times New Roman" w:eastAsia="Times New Roman"/>
-          <w:b w:val="0"/>
-          <w:i w:val="0"/>
-          <w:color w:val="68706F"/>
-          <w:sz w:val="14"/>
-        </w:rPr>
-        <w:t xml:space="preserve"> 68(5), 2000, </w:t>
+        <w:t xml:space="preserve">. [5] Finly, </w:t>
       </w:r>
       <w:hyperlink r:id="rId14">
         <w:r>
           <w:rPr>
             <w:rFonts w:ascii="Times New Roman" w:hAnsi="Times New Roman"/>
-            <w:color w:val="2E6F5C"/>
+            <w:color w:val="1F5A4C"/>
             <w:sz w:val="15"/>
             <w:u w:val="single"/>
           </w:rPr>
-          <w:t>doi:10.1111/1468-0262.00152</w:t>
+          <w:t>Quantitative Release Gate</w:t>
         </w:r>
       </w:hyperlink>
       <w:r>
@@ -655,20 +343,20 @@
           <w:rFonts w:ascii="Times New Roman" w:hAnsi="Times New Roman" w:eastAsia="Times New Roman"/>
           <w:b w:val="0"/>
           <w:i w:val="0"/>
-          <w:color w:val="68706F"/>
-          <w:sz w:val="14"/>
+          <w:color w:val="5F6368"/>
+          <w:sz w:val="15"/>
         </w:rPr>
-        <w:t xml:space="preserve">. [5] Alpaca, </w:t>
+        <w:t xml:space="preserve">. [6] Finly, </w:t>
       </w:r>
       <w:hyperlink r:id="rId15">
         <w:r>
           <w:rPr>
             <w:rFonts w:ascii="Times New Roman" w:hAnsi="Times New Roman"/>
-            <w:color w:val="2E6F5C"/>
+            <w:color w:val="1F5A4C"/>
             <w:sz w:val="15"/>
             <w:u w:val="single"/>
           </w:rPr>
-          <w:t>“Options Trading”</w:t>
+          <w:t>Attempt 115 registration</w:t>
         </w:r>
       </w:hyperlink>
       <w:r>
@@ -676,20 +364,20 @@
           <w:rFonts w:ascii="Times New Roman" w:hAnsi="Times New Roman" w:eastAsia="Times New Roman"/>
           <w:b w:val="0"/>
           <w:i w:val="0"/>
-          <w:color w:val="68706F"/>
-          <w:sz w:val="14"/>
+          <w:color w:val="5F6368"/>
+          <w:sz w:val="15"/>
         </w:rPr>
-        <w:t xml:space="preserve">. [6] Alpaca, </w:t>
+        <w:t xml:space="preserve">. [7] Finly, </w:t>
       </w:r>
       <w:hyperlink r:id="rId16">
         <w:r>
           <w:rPr>
             <w:rFonts w:ascii="Times New Roman" w:hAnsi="Times New Roman"/>
-            <w:color w:val="2E6F5C"/>
+            <w:color w:val="1F5A4C"/>
             <w:sz w:val="15"/>
             <w:u w:val="single"/>
           </w:rPr>
-          <w:t>“Create an Order”</w:t>
+          <w:t>Attempt 116 registration</w:t>
         </w:r>
       </w:hyperlink>
       <w:r>
@@ -697,143 +385,16 @@
           <w:rFonts w:ascii="Times New Roman" w:hAnsi="Times New Roman" w:eastAsia="Times New Roman"/>
           <w:b w:val="0"/>
           <w:i w:val="0"/>
-          <w:color w:val="68706F"/>
-          <w:sz w:val="14"/>
-        </w:rPr>
-        <w:t xml:space="preserve">. [7] Finly, </w:t>
-      </w:r>
-      <w:hyperlink r:id="rId17">
-        <w:r>
-          <w:rPr>
-            <w:rFonts w:ascii="Times New Roman" w:hAnsi="Times New Roman"/>
-            <w:color w:val="2E6F5C"/>
-            <w:sz w:val="15"/>
-            <w:u w:val="single"/>
-          </w:rPr>
-          <w:t>G4 robustness record</w:t>
-        </w:r>
-      </w:hyperlink>
-      <w:r>
-        <w:rPr>
-          <w:rFonts w:ascii="Times New Roman" w:hAnsi="Times New Roman" w:eastAsia="Times New Roman"/>
-          <w:b w:val="0"/>
-          <w:i w:val="0"/>
-          <w:color w:val="68706F"/>
-          <w:sz w:val="14"/>
-        </w:rPr>
-        <w:t xml:space="preserve">. [8] Finly, </w:t>
-      </w:r>
-      <w:hyperlink r:id="rId18">
-        <w:r>
-          <w:rPr>
-            <w:rFonts w:ascii="Times New Roman" w:hAnsi="Times New Roman"/>
-            <w:color w:val="2E6F5C"/>
-            <w:sz w:val="15"/>
-            <w:u w:val="single"/>
-          </w:rPr>
-          <w:t>equity execution-realism audit</w:t>
-        </w:r>
-      </w:hyperlink>
-      <w:r>
-        <w:rPr>
-          <w:rFonts w:ascii="Times New Roman" w:hAnsi="Times New Roman" w:eastAsia="Times New Roman"/>
-          <w:b w:val="0"/>
-          <w:i w:val="0"/>
-          <w:color w:val="68706F"/>
-          <w:sz w:val="14"/>
-        </w:rPr>
-        <w:t xml:space="preserve">. [9] Finly, </w:t>
-      </w:r>
-      <w:hyperlink r:id="rId19">
-        <w:r>
-          <w:rPr>
-            <w:rFonts w:ascii="Times New Roman" w:hAnsi="Times New Roman"/>
-            <w:color w:val="2E6F5C"/>
-            <w:sz w:val="15"/>
-            <w:u w:val="single"/>
-          </w:rPr>
-          <w:t>Alpaca MCP runtime audit</w:t>
-        </w:r>
-      </w:hyperlink>
-      <w:r>
-        <w:rPr>
-          <w:rFonts w:ascii="Times New Roman" w:hAnsi="Times New Roman" w:eastAsia="Times New Roman"/>
-          <w:b w:val="0"/>
-          <w:i w:val="0"/>
-          <w:color w:val="68706F"/>
-          <w:sz w:val="14"/>
-        </w:rPr>
-        <w:t xml:space="preserve">. [10] Finly, </w:t>
-      </w:r>
-      <w:hyperlink r:id="rId20">
-        <w:r>
-          <w:rPr>
-            <w:rFonts w:ascii="Times New Roman" w:hAnsi="Times New Roman"/>
-            <w:color w:val="2E6F5C"/>
-            <w:sz w:val="15"/>
-            <w:u w:val="single"/>
-          </w:rPr>
-          <w:t>Attempt 114 protocol</w:t>
-        </w:r>
-      </w:hyperlink>
-      <w:r>
-        <w:rPr>
-          <w:rFonts w:ascii="Times New Roman" w:hAnsi="Times New Roman" w:eastAsia="Times New Roman"/>
-          <w:b w:val="0"/>
-          <w:i w:val="0"/>
-          <w:color w:val="68706F"/>
-          <w:sz w:val="14"/>
-        </w:rPr>
-        <w:t xml:space="preserve"> and </w:t>
-      </w:r>
-      <w:hyperlink r:id="rId21">
-        <w:r>
-          <w:rPr>
-            <w:rFonts w:ascii="Times New Roman" w:hAnsi="Times New Roman"/>
-            <w:color w:val="2E6F5C"/>
-            <w:sz w:val="15"/>
-            <w:u w:val="single"/>
-          </w:rPr>
-          <w:t>runtime manifest</w:t>
-        </w:r>
-      </w:hyperlink>
-      <w:r>
-        <w:rPr>
-          <w:rFonts w:ascii="Times New Roman" w:hAnsi="Times New Roman" w:eastAsia="Times New Roman"/>
-          <w:b w:val="0"/>
-          <w:i w:val="0"/>
-          <w:color w:val="68706F"/>
-          <w:sz w:val="14"/>
-        </w:rPr>
-        <w:t xml:space="preserve">. [11] Finly, </w:t>
-      </w:r>
-      <w:hyperlink r:id="rId22">
-        <w:r>
-          <w:rPr>
-            <w:rFonts w:ascii="Times New Roman" w:hAnsi="Times New Roman"/>
-            <w:color w:val="2E6F5C"/>
-            <w:sz w:val="15"/>
-            <w:u w:val="single"/>
-          </w:rPr>
-          <w:t>public pre-signal publication receipt</w:t>
-        </w:r>
-      </w:hyperlink>
-      <w:r>
-        <w:rPr>
-          <w:rFonts w:ascii="Times New Roman" w:hAnsi="Times New Roman" w:eastAsia="Times New Roman"/>
-          <w:b w:val="0"/>
-          <w:i w:val="0"/>
-          <w:color w:val="68706F"/>
-          <w:sz w:val="14"/>
+          <w:color w:val="5F6368"/>
+          <w:sz w:val="15"/>
         </w:rPr>
         <w:t>.</w:t>
       </w:r>
     </w:p>
     <w:sectPr>
-      <w:headerReference w:type="default" r:id="rId9"/>
-      <w:footerReference w:type="default" r:id="rId10"/>
+      <w:footerReference w:type="default" r:id="rId9"/>
       <w:pgSz w:w="12240" w:h="15840"/>
-      <w:pgMar w:top="792" w:right="893" w:bottom="691" w:left="893" w:header="317" w:footer="346" w:gutter="0"/>
+      <w:pgMar w:top="979" w:right="1267" w:bottom="893" w:left="1267" w:header="432" w:footer="432" w:gutter="0"/>
       <w:cols w:space="720"/>
       <w:docGrid w:linePitch="360"/>
     </w:sectPr>
@@ -846,212 +407,25 @@
   <w:p>
     <w:pPr>
       <w:pStyle w:val="Footer"/>
-    </w:pPr>
+      <w:spacing w:before="0" w:after="0"/>
+      <w:jc w:val="right"/>
+    </w:pPr>
+    <w:r>
+      <w:rPr>
+        <w:rFonts w:ascii="Times New Roman" w:hAnsi="Times New Roman" w:eastAsia="Times New Roman"/>
+        <w:b w:val="0"/>
+        <w:i w:val="0"/>
+        <w:color w:val="5F6368"/>
+        <w:sz w:val="16"/>
+      </w:rPr>
+      <w:fldChar w:fldCharType="begin"/>
+      <w:instrText xml:space="preserve"> PAGE </w:instrText>
+      <w:fldChar w:fldCharType="separate"/>
+      <w:t>1</w:t>
+      <w:fldChar w:fldCharType="end"/>
+    </w:r>
   </w:p>
-  <w:tbl>
-    <w:tblPr>
-      <w:tblW w:type="auto" w:w="0"/>
-      <w:jc w:val="center"/>
-      <w:tblLayout w:type="fixed"/>
-      <w:tblLook w:firstColumn="1" w:firstRow="1" w:lastColumn="0" w:lastRow="0" w:noHBand="0" w:noVBand="1" w:val="04A0"/>
-      <w:tblBorders>
-        <w:top w:val="single" w:sz="0" w:space="0" w:color="FFFFFF"/>
-        <w:left w:val="single" w:sz="0" w:space="0" w:color="FFFFFF"/>
-        <w:bottom w:val="single" w:sz="0" w:space="0" w:color="FFFFFF"/>
-        <w:right w:val="single" w:sz="0" w:space="0" w:color="FFFFFF"/>
-        <w:insideH w:val="single" w:sz="0" w:space="0" w:color="FFFFFF"/>
-        <w:insideV w:val="single" w:sz="0" w:space="0" w:color="FFFFFF"/>
-      </w:tblBorders>
-    </w:tblPr>
-    <w:tblGrid>
-      <w:gridCol w:w="8928"/>
-      <w:gridCol w:w="1440"/>
-    </w:tblGrid>
-    <w:tr>
-      <w:tc>
-        <w:tcPr>
-          <w:tcW w:type="dxa" w:w="5184"/>
-          <w:tcMar>
-            <w:top w:w="30" w:type="dxa"/>
-            <w:start w:w="0" w:type="dxa"/>
-            <w:bottom w:w="0" w:type="dxa"/>
-            <w:end w:w="0" w:type="dxa"/>
-          </w:tcMar>
-        </w:tcPr>
-        <w:p>
-          <w:r>
-            <w:rPr>
-              <w:rFonts w:ascii="Arial" w:hAnsi="Arial" w:eastAsia="Arial"/>
-              <w:b w:val="0"/>
-              <w:i w:val="0"/>
-              <w:color w:val="68706F"/>
-              <w:sz w:val="14"/>
-            </w:rPr>
-            <w:t>Controlled delegation: judgment may inform; deterministic code retains authority.</w:t>
-          </w:r>
-        </w:p>
-      </w:tc>
-      <w:tc>
-        <w:tcPr>
-          <w:tcW w:type="dxa" w:w="5184"/>
-          <w:tcMar>
-            <w:top w:w="30" w:type="dxa"/>
-            <w:start w:w="0" w:type="dxa"/>
-            <w:bottom w:w="0" w:type="dxa"/>
-            <w:end w:w="0" w:type="dxa"/>
-          </w:tcMar>
-        </w:tcPr>
-        <w:p>
-          <w:pPr>
-            <w:jc w:val="right"/>
-          </w:pPr>
-          <w:r>
-            <w:rPr>
-              <w:rFonts w:ascii="Arial" w:hAnsi="Arial" w:eastAsia="Arial"/>
-              <w:b w:val="0"/>
-              <w:i w:val="0"/>
-              <w:color w:val="68706F"/>
-              <w:sz w:val="15"/>
-            </w:rPr>
-            <w:fldChar w:fldCharType="begin"/>
-            <w:instrText xml:space="preserve"> PAGE </w:instrText>
-            <w:fldChar w:fldCharType="separate"/>
-            <w:fldChar w:fldCharType="end"/>
-          </w:r>
-        </w:p>
-      </w:tc>
-    </w:tr>
-  </w:tbl>
 </w:ftr>
-</file>
-
-<file path=word/header1.xml><?xml version="1.0" encoding="utf-8"?>
-<w:hdr xmlns:m="http://schemas.openxmlformats.org/officeDocument/2006/math" xmlns:mc="http://schemas.openxmlformats.org/markup-compatibility/2006" xmlns:mo="http://schemas.microsoft.com/office/mac/office/2008/main" xmlns:mv="urn:schemas-microsoft-com:mac:vml" xmlns:o="urn:schemas-microsoft-com:office:office" xmlns:r="http://schemas.openxmlformats.org/officeDocument/2006/relationships" xmlns:v="urn:schemas-microsoft-com:vml" xmlns:w10="urn:schemas-microsoft-com:office:word" xmlns:w14="http://schemas.microsoft.com/office/word/2010/wordml" xmlns:w="http://schemas.openxmlformats.org/wordprocessingml/2006/main" xmlns:wne="http://schemas.microsoft.com/office/word/2006/wordml" xmlns:wp14="http://schemas.microsoft.com/office/word/2010/wordprocessingDrawing" xmlns:wp="http://schemas.openxmlformats.org/drawingml/2006/wordprocessingDrawing" xmlns:wpc="http://schemas.microsoft.com/office/word/2010/wordprocessingCanvas" xmlns:wpg="http://schemas.microsoft.com/office/word/2010/wordprocessingGroup" xmlns:wpi="http://schemas.microsoft.com/office/word/2010/wordprocessingInk" xmlns:wps="http://schemas.microsoft.com/office/word/2010/wordprocessingShape" mc:Ignorable="w14 wp14">
-  <w:p>
-    <w:pPr>
-      <w:pStyle w:val="Header"/>
-    </w:pPr>
-  </w:p>
-  <w:tbl>
-    <w:tblPr>
-      <w:tblW w:type="auto" w:w="0"/>
-      <w:jc w:val="center"/>
-      <w:tblLayout w:type="fixed"/>
-      <w:tblLook w:firstColumn="1" w:firstRow="1" w:lastColumn="0" w:lastRow="0" w:noHBand="0" w:noVBand="1" w:val="04A0"/>
-      <w:tblBorders>
-        <w:top w:val="single" w:sz="0" w:space="0" w:color="FFFFFF"/>
-        <w:left w:val="single" w:sz="0" w:space="0" w:color="FFFFFF"/>
-        <w:bottom w:val="single" w:sz="0" w:space="0" w:color="FFFFFF"/>
-        <w:right w:val="single" w:sz="0" w:space="0" w:color="FFFFFF"/>
-        <w:insideH w:val="single" w:sz="0" w:space="0" w:color="FFFFFF"/>
-        <w:insideV w:val="single" w:sz="0" w:space="0" w:color="FFFFFF"/>
-      </w:tblBorders>
-    </w:tblPr>
-    <w:tblGrid>
-      <w:gridCol w:w="6912"/>
-      <w:gridCol w:w="3456"/>
-    </w:tblGrid>
-    <w:tr>
-      <w:tc>
-        <w:tcPr>
-          <w:tcW w:type="dxa" w:w="6912"/>
-          <w:tcMar>
-            <w:top w:w="0" w:type="dxa"/>
-            <w:start w:w="0" w:type="dxa"/>
-            <w:bottom w:w="50" w:type="dxa"/>
-            <w:end w:w="0" w:type="dxa"/>
-          </w:tcMar>
-        </w:tcPr>
-        <w:p>
-          <w:pPr>
-            <w:jc w:val="left"/>
-          </w:pPr>
-          <w:r>
-            <w:drawing>
-              <wp:inline xmlns:a="http://schemas.openxmlformats.org/drawingml/2006/main" xmlns:pic="http://schemas.openxmlformats.org/drawingml/2006/picture">
-                <wp:extent cx="228600" cy="228600"/>
-                <wp:docPr id="1" name="Picture 1"/>
-                <wp:cNvGraphicFramePr>
-                  <a:graphicFrameLocks noChangeAspect="1"/>
-                </wp:cNvGraphicFramePr>
-                <a:graphic>
-                  <a:graphicData uri="http://schemas.openxmlformats.org/drawingml/2006/picture">
-                    <pic:pic>
-                      <pic:nvPicPr>
-                        <pic:cNvPr id="0" name="finly-bull-512.png"/>
-                        <pic:cNvPicPr/>
-                      </pic:nvPicPr>
-                      <pic:blipFill>
-                        <a:blip r:embed="rId1"/>
-                        <a:stretch>
-                          <a:fillRect/>
-                        </a:stretch>
-                      </pic:blipFill>
-                      <pic:spPr>
-                        <a:xfrm>
-                          <a:off x="0" y="0"/>
-                          <a:ext cx="228600" cy="228600"/>
-                        </a:xfrm>
-                        <a:prstGeom prst="rect"/>
-                      </pic:spPr>
-                    </pic:pic>
-                  </a:graphicData>
-                </a:graphic>
-              </wp:inline>
-            </w:drawing>
-          </w:r>
-          <w:r>
-            <w:t xml:space="preserve">  </w:t>
-          </w:r>
-          <w:r>
-            <w:rPr>
-              <w:rFonts w:ascii="Arial" w:hAnsi="Arial" w:eastAsia="Arial"/>
-              <w:b/>
-              <w:i w:val="0"/>
-              <w:color w:val="2E6F5C"/>
-              <w:sz w:val="15"/>
-            </w:rPr>
-            <w:t>FINLY / ONE-PAGE JUDGE PROPOSAL</w:t>
-          </w:r>
-        </w:p>
-      </w:tc>
-      <w:tc>
-        <w:tcPr>
-          <w:tcW w:type="dxa" w:w="3456"/>
-          <w:tcMar>
-            <w:top w:w="0" w:type="dxa"/>
-            <w:start w:w="0" w:type="dxa"/>
-            <w:bottom w:w="50" w:type="dxa"/>
-            <w:end w:w="0" w:type="dxa"/>
-          </w:tcMar>
-        </w:tcPr>
-        <w:p>
-          <w:pPr>
-            <w:jc w:val="right"/>
-          </w:pPr>
-          <w:r>
-            <w:rPr>
-              <w:rFonts w:ascii="Arial" w:hAnsi="Arial" w:eastAsia="Arial"/>
-              <w:b/>
-              <w:i w:val="0"/>
-              <w:color w:val="68706F"/>
-              <w:sz w:val="15"/>
-            </w:rPr>
-            <w:t>30 AUGUST 2026</w:t>
-          </w:r>
-        </w:p>
-      </w:tc>
-    </w:tr>
-  </w:tbl>
-  <w:p>
-    <w:pPr>
-      <w:spacing w:after="0"/>
-      <w:pBdr>
-        <w:bottom w:val="single" w:sz="5" w:space="0" w:color="0D2B43"/>
-      </w:pBdr>
-    </w:pPr>
-  </w:p>
-</w:hdr>
 </file>
 
 <file path=word/numbering.xml><?xml version="1.0" encoding="utf-8"?>
@@ -1419,12 +793,12 @@
     <w:rsid w:val="00FC693F"/>
     <w:pPr>
       <w:widowControl/>
-      <w:spacing w:after="80" w:line="259" w:lineRule="auto"/>
+      <w:spacing w:before="0" w:after="140" w:line="276" w:lineRule="auto"/>
     </w:pPr>
     <w:rPr>
       <w:rFonts w:ascii="Times New Roman" w:hAnsi="Times New Roman" w:eastAsia="Times New Roman"/>
-      <w:color w:val="263238"/>
-      <w:sz w:val="19"/>
+      <w:color w:val="171717"/>
+      <w:sz w:val="22"/>
     </w:rPr>
   </w:style>
   <w:style w:type="paragraph" w:styleId="Header">

</xml_diff>

<commit_message>
Rewrite judge papers around current product
</commit_message>
<xml_diff>
--- a/public/judge/Finly_Judge_Proposal.docx
+++ b/public/judge/Finly_Judge_Proposal.docx
@@ -15,7 +15,7 @@
           <w:color w:val="171717"/>
           <w:sz w:val="37"/>
         </w:rPr>
-        <w:t>Finly: A Trading Agent That Knows When Not to Trade</w:t>
+        <w:t>Finly: An AI Trading Agent That Shows Its Work</w:t>
       </w:r>
     </w:p>
     <w:p>
@@ -50,7 +50,7 @@
           <w:color w:val="5F6368"/>
           <w:sz w:val="16"/>
         </w:rPr>
-        <w:t>Proposal for the Alpaca AI Trading Agents Hackathon · Evidence through 30 August 2026</w:t>
+        <w:t>Proposal for the Alpaca AI Trading Agents Hackathon · 31 August 2026</w:t>
       </w:r>
     </w:p>
     <w:p>
@@ -69,7 +69,7 @@
           <w:color w:val="171717"/>
           <w:sz w:val="22"/>
         </w:rPr>
-        <w:t>What should an AI trading agent be allowed to decide? The obvious answer is that a capable model should read more evidence, form a better view, and place the corresponding trade. Finly begins from the opposite concern. In markets, a persuasive explanation and an authorized exposure are different things: one can be evaluated in words; the other can lose capital before anyone has resolved whether the explanation was sound. Finly therefore gives AI a serious but limited role. A model may interpret a bounded evidence bundle, state its reasons, and veto a proposed action. Deterministic code retains the decisions that directly create risk: market direction, horizon, structure, order fields, maximum loss, and the final choice between permission and no trade. The proposal is not to make the model decorative. It is to make its authority proportionate to the evidence. That division makes the demo inspectable. A judge can follow a source from ingestion to interpretation, compare the model's typed response with the code-owned intent, and see why disagreement removes permission rather than being smoothed into a more confident order. The resulting record identifies which judgment failed and who still owned the risk.</w:t>
+        <w:t>An artificial intelligence can read a great deal about a market, but this does not mean that it should decide how much capital to risk. Finly begins with that distinction. It is a paper-trading system in which a language model interprets a small body of current public evidence, while ordinary code controls direction, exposure, contract selection, order fields, and permission to trade. The model may explain uncertainty and stop an options proposal. It cannot enlarge the position or rewrite its economic terms. Finly keeps what language models do well—the comparison of heterogeneous information—without asking prose to serve as a risk engine.</w:t>
       </w:r>
     </w:p>
     <w:p>
@@ -88,7 +88,7 @@
           <w:color w:val="171717"/>
           <w:sz w:val="22"/>
         </w:rPr>
-        <w:t>The project tests this boundary against its own strongest temptation. In the consumed, post-selected 2013-01-02–2026-08-27 retrospective replay with modeled 5 bp one-way costs, G4 returned +967.11% versus SPY +580.82%; promotion was rejected because the Deflated Sharpe probability was 3.75% and the worst familywise-adjusted p-value was 37.18%. That is the result a conventional pitch would enlarge and leave unexplained. Finly instead keeps the rejection beside the return. G4 is not the production policy and not evidence of future market superiority [3–5]. The refusal matters because a backtest is most dangerous when it is attractive enough to silence the question of how it was found.</w:t>
+        <w:t>The system has two parts. Its frozen G4 equity rule holds half of its risky allocation in QQQ and divides the other half among the three strongest of the original nine Select Sector SPDR funds, ranked by twelve-to-six-month momentum. The competition signal used Alpaca IEX data through 28 August 2026 and selected XLB, XLE, and XLV. A three-percent cash reserve sets the paper-account targets at 48.5 percent QQQ and 16.1667 percent in each selected sector. The rule, inputs, allocation, order identities, and competition window were fixed before the opening bell; there is no in-contest re-optimization [1,2].</w:t>
       </w:r>
     </w:p>
     <w:p>
@@ -107,7 +107,7 @@
           <w:color w:val="171717"/>
           <w:sz w:val="22"/>
         </w:rPr>
-        <w:t>The frozen production policy makes a smaller claim. Production v1 is the frozen unlevered SPY/BIL policy targeting 10% annualized volatility: in the consumed 2025-01-02–2026-08-28 modeled next-open study it returned +15.39% at 5 bp per traded leg and +10.56% at 25 bp, versus SPY +33.52%; at 5 bp its modeled annualized volatility was 8.12% and maximum drawdown was -5.45%, so it was risk-controlled but not market-beating on total return. The study is a theoretical adjusted-OHLC ledger, not broker fills or options profit and loss [1,2,5]. This distinction turns an apparent weakness into useful information. Judges can see what the policy bought, what it surrendered, and what remains unproved.</w:t>
+        <w:t>Finly's separate SPY options workflow turns public news, market observations, option data, event information, and a small prediction-market input into a reviewable decision. A hosted Qwen3-32B model reads only public news. Code then applies freshness, liquidity, payoff, buying-power, and risk limits before it can build a bull-call spread, a bear-put spread, or no trade. A short-lived permit ties the checked evidence and risk calculation to one exact paper order. In the public demonstration, Finly produced a SPY debit spread with a maximum loss of $366 and a maximum gain of $634. The required safety behavior survived all four source-removal checks and all thirty-two input changes [3].</w:t>
       </w:r>
     </w:p>
     <w:p>
@@ -126,7 +126,26 @@
           <w:color w:val="171717"/>
           <w:sz w:val="22"/>
         </w:rPr>
-        <w:t>Finly's final step is prospective rather than rhetorical. Attempts 115 and 116 are publicly registered future-only tests. As of 2026-08-30T08:10:52.000Z, each had zero observed outcomes, and neither supports a performance claim. [6,7] That empty record is intentional: it prevents a favorable history from being relabeled as a forward test. At the Generation 7 capture, 20 projects were visible and zero supplied an exact same-panel submitted-options comparator; missing P&amp;L is unknown, never zero, and supports neither a return matchup nor a competitor rank. [5] Finly should therefore be judged on what it presently demonstrates: a working separation between interpretation and authorization, a research process capable of rejecting its best-looking historical survivor, a frozen policy described without disguising its tradeoff, and a public experiment that can earn a stronger claim later. The governing principle is modest but consequential: when capital is at risk, intelligence should widen inquiry before it widens authority.</w:t>
+        <w:t>The historical case gives a concrete reason to test this architecture. In a 2013–2026 simulation with five basis points of modeled one-way cost, $10,000 became $106,711 under G4 and $68,082 under SPY—a $38,629 difference [4]. Because G4 was selected during research, that result is evidence about the past, not a promise about the competition. We therefore reran a fixed industry version on Kenneth French's public data from 1927 through 2007. Across 21,218 earlier trading days, it annualized at 13.37 percent against 9.48 percent for the market, stayed ahead at all twenty-one monthly anchors, retained a 2.45-percentage-point advantage under a twenty-five-basis-point cost stress, and had a maximum drawdown 16.31 percentage points shallower [5,6].</w:t>
+      </w:r>
+    </w:p>
+    <w:p>
+      <w:pPr>
+        <w:keepLines/>
+        <w:widowControl/>
+        <w:spacing w:line="276" w:lineRule="auto" w:after="140"/>
+        <w:ind w:firstLine="302"/>
+        <w:jc w:val="both"/>
+      </w:pPr>
+      <w:r>
+        <w:rPr>
+          <w:rFonts w:ascii="Times New Roman" w:hAnsi="Times New Roman" w:eastAsia="Times New Roman"/>
+          <w:b w:val="0"/>
+          <w:i w:val="0"/>
+          <w:color w:val="171717"/>
+          <w:sz w:val="22"/>
+        </w:rPr>
+        <w:t>Finly now runs through Alpaca's official MCP server against a dedicated $100,000 paper account. Before an order, the cloud runner checks the account, frozen signal, market session, asset eligibility, cash, and intended amount. It records each intent before submission, reads the broker state back afterward, and uses fixed order identities to avoid duplicates after a lost acknowledgement. Private restart state is encrypted; the public dashboard shows only sanitized account and decision fields [7–9]. The repository's 803 automated tests—801 passing and two skipped in the public run—exercise the calculations, broker translation, restart logic, and safety limits [10]. No replay can settle what the frozen rule will earn next. Finly supplies a public way to learn the answer while keeping the model useful, the risk finite, and every trade open to inspection.</w:t>
       </w:r>
     </w:p>
     <w:p>
@@ -161,27 +180,7 @@
           <w:color w:val="5F6368"/>
           <w:sz w:val="15"/>
         </w:rPr>
-        <w:t xml:space="preserve">[1] T. J. Moskowitz, Y. H. Ooi, and L. H. Pedersen, “Time Series Momentum,” </w:t>
-      </w:r>
-      <w:r>
-        <w:rPr>
-          <w:rFonts w:ascii="Times New Roman" w:hAnsi="Times New Roman" w:eastAsia="Times New Roman"/>
-          <w:b w:val="0"/>
-          <w:i/>
-          <w:color w:val="5F6368"/>
-          <w:sz w:val="15"/>
-        </w:rPr>
-        <w:t>Journal of Financial Economics</w:t>
-      </w:r>
-      <w:r>
-        <w:rPr>
-          <w:rFonts w:ascii="Times New Roman" w:hAnsi="Times New Roman" w:eastAsia="Times New Roman"/>
-          <w:b w:val="0"/>
-          <w:i w:val="0"/>
-          <w:color w:val="5F6368"/>
-          <w:sz w:val="15"/>
-        </w:rPr>
-        <w:t xml:space="preserve"> 104 (2012), 228–250, </w:t>
+        <w:t xml:space="preserve">[1] Finly, </w:t>
       </w:r>
       <w:hyperlink r:id="rId10">
         <w:r>
@@ -191,7 +190,7 @@
             <w:sz w:val="15"/>
             <w:u w:val="single"/>
           </w:rPr>
-          <w:t>doi:10.1016/j.jfineco.2011.11.003</w:t>
+          <w:t>Frozen G4 competition protocol</w:t>
         </w:r>
       </w:hyperlink>
       <w:r>
@@ -202,27 +201,7 @@
           <w:color w:val="5F6368"/>
           <w:sz w:val="15"/>
         </w:rPr>
-        <w:t xml:space="preserve">. [2] A. Moreira and T. Muir, “Volatility-Managed Portfolios,” </w:t>
-      </w:r>
-      <w:r>
-        <w:rPr>
-          <w:rFonts w:ascii="Times New Roman" w:hAnsi="Times New Roman" w:eastAsia="Times New Roman"/>
-          <w:b w:val="0"/>
-          <w:i/>
-          <w:color w:val="5F6368"/>
-          <w:sz w:val="15"/>
-        </w:rPr>
-        <w:t>Journal of Finance</w:t>
-      </w:r>
-      <w:r>
-        <w:rPr>
-          <w:rFonts w:ascii="Times New Roman" w:hAnsi="Times New Roman" w:eastAsia="Times New Roman"/>
-          <w:b w:val="0"/>
-          <w:i w:val="0"/>
-          <w:color w:val="5F6368"/>
-          <w:sz w:val="15"/>
-        </w:rPr>
-        <w:t xml:space="preserve"> 72 (2017), 1611–1644, </w:t>
+        <w:t xml:space="preserve">. [2] Finly, </w:t>
       </w:r>
       <w:hyperlink r:id="rId11">
         <w:r>
@@ -232,7 +211,7 @@
             <w:sz w:val="15"/>
             <w:u w:val="single"/>
           </w:rPr>
-          <w:t>doi:10.1111/jofi.12513</w:t>
+          <w:t>Frozen G4 source signal</w:t>
         </w:r>
       </w:hyperlink>
       <w:r>
@@ -243,27 +222,7 @@
           <w:color w:val="5F6368"/>
           <w:sz w:val="15"/>
         </w:rPr>
-        <w:t xml:space="preserve">. [3] H. White, “A Reality Check for Data Snooping,” </w:t>
-      </w:r>
-      <w:r>
-        <w:rPr>
-          <w:rFonts w:ascii="Times New Roman" w:hAnsi="Times New Roman" w:eastAsia="Times New Roman"/>
-          <w:b w:val="0"/>
-          <w:i/>
-          <w:color w:val="5F6368"/>
-          <w:sz w:val="15"/>
-        </w:rPr>
-        <w:t>Econometrica</w:t>
-      </w:r>
-      <w:r>
-        <w:rPr>
-          <w:rFonts w:ascii="Times New Roman" w:hAnsi="Times New Roman" w:eastAsia="Times New Roman"/>
-          <w:b w:val="0"/>
-          <w:i w:val="0"/>
-          <w:color w:val="5F6368"/>
-          <w:sz w:val="15"/>
-        </w:rPr>
-        <w:t xml:space="preserve"> 68 (2000), 1097–1126, </w:t>
+        <w:t xml:space="preserve">. [3] Finly, </w:t>
       </w:r>
       <w:hyperlink r:id="rId12">
         <w:r>
@@ -273,7 +232,7 @@
             <w:sz w:val="15"/>
             <w:u w:val="single"/>
           </w:rPr>
-          <w:t>doi:10.1111/1468-0262.00152</w:t>
+          <w:t>Latest options decision receipt</w:t>
         </w:r>
       </w:hyperlink>
       <w:r>
@@ -284,27 +243,7 @@
           <w:color w:val="5F6368"/>
           <w:sz w:val="15"/>
         </w:rPr>
-        <w:t xml:space="preserve">. [4] D. H. Bailey and M. López de Prado, “The Deflated Sharpe Ratio,” </w:t>
-      </w:r>
-      <w:r>
-        <w:rPr>
-          <w:rFonts w:ascii="Times New Roman" w:hAnsi="Times New Roman" w:eastAsia="Times New Roman"/>
-          <w:b w:val="0"/>
-          <w:i/>
-          <w:color w:val="5F6368"/>
-          <w:sz w:val="15"/>
-        </w:rPr>
-        <w:t>Journal of Portfolio Management</w:t>
-      </w:r>
-      <w:r>
-        <w:rPr>
-          <w:rFonts w:ascii="Times New Roman" w:hAnsi="Times New Roman" w:eastAsia="Times New Roman"/>
-          <w:b w:val="0"/>
-          <w:i w:val="0"/>
-          <w:color w:val="5F6368"/>
-          <w:sz w:val="15"/>
-        </w:rPr>
-        <w:t xml:space="preserve"> 40 (2014), 94–107, </w:t>
+        <w:t xml:space="preserve">. [4] Finly, </w:t>
       </w:r>
       <w:hyperlink r:id="rId13">
         <w:r>
@@ -314,7 +253,7 @@
             <w:sz w:val="15"/>
             <w:u w:val="single"/>
           </w:rPr>
-          <w:t>doi:10.3905/jpm.2014.40.5.094</w:t>
+          <w:t>Quantitative release gate</w:t>
         </w:r>
       </w:hyperlink>
       <w:r>
@@ -325,7 +264,7 @@
           <w:color w:val="5F6368"/>
           <w:sz w:val="15"/>
         </w:rPr>
-        <w:t xml:space="preserve">. [5] Finly, </w:t>
+        <w:t xml:space="preserve">. [5] Kenneth R. French, </w:t>
       </w:r>
       <w:hyperlink r:id="rId14">
         <w:r>
@@ -335,7 +274,7 @@
             <w:sz w:val="15"/>
             <w:u w:val="single"/>
           </w:rPr>
-          <w:t>Quantitative Release Gate</w:t>
+          <w:t>Data Library</w:t>
         </w:r>
       </w:hyperlink>
       <w:r>
@@ -356,7 +295,7 @@
             <w:sz w:val="15"/>
             <w:u w:val="single"/>
           </w:rPr>
-          <w:t>Attempt 115 registration</w:t>
+          <w:t>External-era public evidence</w:t>
         </w:r>
       </w:hyperlink>
       <w:r>
@@ -367,7 +306,7 @@
           <w:color w:val="5F6368"/>
           <w:sz w:val="15"/>
         </w:rPr>
-        <w:t xml:space="preserve">. [7] Finly, </w:t>
+        <w:t xml:space="preserve">. [7] Alpaca, </w:t>
       </w:r>
       <w:hyperlink r:id="rId16">
         <w:r>
@@ -377,7 +316,70 @@
             <w:sz w:val="15"/>
             <w:u w:val="single"/>
           </w:rPr>
-          <w:t>Attempt 116 registration</w:t>
+          <w:t>MCP Server</w:t>
+        </w:r>
+      </w:hyperlink>
+      <w:r>
+        <w:rPr>
+          <w:rFonts w:ascii="Times New Roman" w:hAnsi="Times New Roman" w:eastAsia="Times New Roman"/>
+          <w:b w:val="0"/>
+          <w:i w:val="0"/>
+          <w:color w:val="5F6368"/>
+          <w:sz w:val="15"/>
+        </w:rPr>
+        <w:t xml:space="preserve">. [8] Finly, </w:t>
+      </w:r>
+      <w:hyperlink r:id="rId17">
+        <w:r>
+          <w:rPr>
+            <w:rFonts w:ascii="Times New Roman" w:hAnsi="Times New Roman"/>
+            <w:color w:val="1F5A4C"/>
+            <w:sz w:val="15"/>
+            <w:u w:val="single"/>
+          </w:rPr>
+          <w:t>Cloud runner and restart design</w:t>
+        </w:r>
+      </w:hyperlink>
+      <w:r>
+        <w:rPr>
+          <w:rFonts w:ascii="Times New Roman" w:hAnsi="Times New Roman" w:eastAsia="Times New Roman"/>
+          <w:b w:val="0"/>
+          <w:i w:val="0"/>
+          <w:color w:val="5F6368"/>
+          <w:sz w:val="15"/>
+        </w:rPr>
+        <w:t xml:space="preserve">. [9] Finly, </w:t>
+      </w:r>
+      <w:hyperlink r:id="rId18">
+        <w:r>
+          <w:rPr>
+            <w:rFonts w:ascii="Times New Roman" w:hAnsi="Times New Roman"/>
+            <w:color w:val="1F5A4C"/>
+            <w:sz w:val="15"/>
+            <w:u w:val="single"/>
+          </w:rPr>
+          <w:t>Sanitized competition account snapshot</w:t>
+        </w:r>
+      </w:hyperlink>
+      <w:r>
+        <w:rPr>
+          <w:rFonts w:ascii="Times New Roman" w:hAnsi="Times New Roman" w:eastAsia="Times New Roman"/>
+          <w:b w:val="0"/>
+          <w:i w:val="0"/>
+          <w:color w:val="5F6368"/>
+          <w:sz w:val="15"/>
+        </w:rPr>
+        <w:t xml:space="preserve">. [10] Finly, </w:t>
+      </w:r>
+      <w:hyperlink r:id="rId19">
+        <w:r>
+          <w:rPr>
+            <w:rFonts w:ascii="Times New Roman" w:hAnsi="Times New Roman"/>
+            <w:color w:val="1F5A4C"/>
+            <w:sz w:val="15"/>
+            <w:u w:val="single"/>
+          </w:rPr>
+          <w:t>Public automated-test run</w:t>
         </w:r>
       </w:hyperlink>
       <w:r>

</xml_diff>

<commit_message>
feat: ship final judge-facing release
</commit_message>
<xml_diff>
--- a/public/judge/Finly_Judge_Proposal.docx
+++ b/public/judge/Finly_Judge_Proposal.docx
@@ -126,7 +126,7 @@
           <w:color w:val="171717"/>
           <w:sz w:val="22"/>
         </w:rPr>
-        <w:t>The historical case gives a concrete reason to test this architecture. In a 2013–2026 simulation with five basis points of modeled one-way cost, $10,000 became $106,711 under G4 and $68,082 under SPY—a $38,629 difference [4]. Because G4 was selected during research, that result is evidence about the past, not a promise about the competition. We therefore reran a fixed industry version on Kenneth French's public data from 1927 through 2007. Across 21,218 earlier trading days, it annualized at 13.37 percent against 9.48 percent for the market, stayed ahead at all twenty-one monthly anchors, retained a 2.45-percentage-point advantage under a twenty-five-basis-point cost stress, and had a maximum drawdown 16.31 percentage points shallower [5,6].</w:t>
+        <w:t>The historical case gives a concrete reason to test Finly. In a 2013–2026 simulation with modeled one-way costs of five basis points, $10,000 became $106,711 under G4 and $68,082 under SPY—a $38,629 difference [4]. A fixed 1927–2007 industry replay added an earlier-era check: across 21,218 days, it annualized at 13.37 percent against 9.48 percent, stayed ahead at all twenty-one monthly anchors, retained a 2.45-percentage-point advantage under a twenty-five-basis-point cost stress, and had a maximum drawdown 16.31 percentage points shallower [5,6]. The research gate treated that upside as a reason to test G4, not to promote it statistically. A human then froze the competition allocation, and a separate scorer measures the $100,000 account against its baseline and contemporaneous SPY [1,4,10].</w:t>
       </w:r>
     </w:p>
     <w:p>
@@ -145,7 +145,7 @@
           <w:color w:val="171717"/>
           <w:sz w:val="22"/>
         </w:rPr>
-        <w:t>Finly now runs through Alpaca's official MCP server against a dedicated $100,000 paper account. Before an order, the cloud runner checks the account, frozen signal, market session, asset eligibility, cash, and intended amount. It records each intent before submission, reads the broker state back afterward, and uses fixed order identities to avoid duplicates after a lost acknowledgement. Private restart state is encrypted; the public dashboard shows only sanitized account and decision fields [7–9]. The repository's 803 automated tests—801 passing and two skipped in the public run—exercise the calculations, broker translation, restart logic, and safety limits [10]. No replay can settle what the frozen rule will earn next. Finly supplies a public way to learn the answer while keeping the model useful, the risk finite, and every trade open to inspection.</w:t>
+        <w:t>Finly now runs through Alpaca's official MCP server against a dedicated $100,000 paper account. Before an order, the cloud runner checks the account, frozen signal, market session, asset eligibility, cash, and intended amount. It records each intent before submission, reads the broker state back afterward, and uses fixed order identities to avoid duplicates after a lost acknowledgement. Private restart state is encrypted; the public dashboard shows only sanitized account and decision fields [7–9]. The repository's 806 automated tests—804 passing and two skipped in the public run—exercise the calculations, broker translation, restart logic, and safety limits [11]. No replay can settle what the frozen rule will earn next. Finly supplies a public way to learn the answer while keeping the model useful, the risk finite, and every trade open to inspection.</w:t>
       </w:r>
     </w:p>
     <w:p>
@@ -372,6 +372,27 @@
         <w:t xml:space="preserve">. [10] Finly, </w:t>
       </w:r>
       <w:hyperlink r:id="rId19">
+        <w:r>
+          <w:rPr>
+            <w:rFonts w:ascii="Times New Roman" w:hAnsi="Times New Roman"/>
+            <w:color w:val="1F5A4C"/>
+            <w:sz w:val="15"/>
+            <w:u w:val="single"/>
+          </w:rPr>
+          <w:t>Competition forward-profit contract</w:t>
+        </w:r>
+      </w:hyperlink>
+      <w:r>
+        <w:rPr>
+          <w:rFonts w:ascii="Times New Roman" w:hAnsi="Times New Roman" w:eastAsia="Times New Roman"/>
+          <w:b w:val="0"/>
+          <w:i w:val="0"/>
+          <w:color w:val="5F6368"/>
+          <w:sz w:val="15"/>
+        </w:rPr>
+        <w:t xml:space="preserve">. [11] Finly, </w:t>
+      </w:r>
+      <w:hyperlink r:id="rId20">
         <w:r>
           <w:rPr>
             <w:rFonts w:ascii="Times New Roman" w:hAnsi="Times New Roman"/>

</xml_diff>

<commit_message>
docs: rebuild final judge materials
</commit_message>
<xml_diff>
--- a/public/judge/Finly_Judge_Proposal.docx
+++ b/public/judge/Finly_Judge_Proposal.docx
@@ -15,7 +15,7 @@
           <w:color w:val="171717"/>
           <w:sz w:val="37"/>
         </w:rPr>
-        <w:t>Finly: An AI Trading Agent That Shows Its Work</w:t>
+        <w:t>Finly: The AI Trading Agent That Shows Its Work</w:t>
       </w:r>
     </w:p>
     <w:p>
@@ -59,7 +59,7 @@
         <w:widowControl/>
         <w:spacing w:line="276" w:lineRule="auto" w:after="140"/>
         <w:ind w:firstLine="0"/>
-        <w:jc w:val="both"/>
+        <w:jc w:val="left"/>
       </w:pPr>
       <w:r>
         <w:rPr>
@@ -69,7 +69,7 @@
           <w:color w:val="171717"/>
           <w:sz w:val="22"/>
         </w:rPr>
-        <w:t>An artificial intelligence can read a great deal about a market, but this does not mean that it should decide how much capital to risk. Finly begins with that distinction. It is a paper-trading system in which a language model interprets a small body of current public evidence, while ordinary code controls direction, exposure, contract selection, order fields, and permission to trade. The model may explain uncertainty and stop an options proposal. It cannot enlarge the position or rewrite its economic terms. Finly keeps what language models do well—the comparison of heterogeneous information—without asking prose to serve as a risk engine.</w:t>
+        <w:t>Finly is an AI trading agent that shows its work before it risks a dollar. Most trading agents ask one model to read the market, choose a position, size it, and send the order. Finly separates those jobs. AI interprets public evidence and explains support or conflict; code controls direction, contracts, position size, maximum loss, and every field sent to Alpaca. Investors get the speed of AI without handing a language model unrestricted control of a brokerage account.</w:t>
       </w:r>
     </w:p>
     <w:p>
@@ -78,7 +78,7 @@
         <w:widowControl/>
         <w:spacing w:line="276" w:lineRule="auto" w:after="140"/>
         <w:ind w:firstLine="302"/>
-        <w:jc w:val="both"/>
+        <w:jc w:val="left"/>
       </w:pPr>
       <w:r>
         <w:rPr>
@@ -88,7 +88,7 @@
           <w:color w:val="171717"/>
           <w:sz w:val="22"/>
         </w:rPr>
-        <w:t>The system has two parts. Its frozen G4 equity rule holds half of its risky allocation in QQQ and divides the other half among the three strongest of the original nine Select Sector SPDR funds, ranked by twelve-to-six-month momentum. The competition signal used Alpaca IEX data through 28 August 2026 and selected XLB, XLE, and XLV. A three-percent cash reserve sets the paper-account targets at 48.5 percent QQQ and 16.1667 percent in each selected sector. The rule, inputs, allocation, order identities, and competition window were fixed before the opening bell; there is no in-contest re-optimization [1,2].</w:t>
+        <w:t>For this hackathon, Finly runs in the cloud against a dedicated, verified $100,000 Alpaca paper account. A frozen four-fund equity allocation provides the portfolio base: QQQ plus three sector funds selected before the opening bell by a transparent momentum rule, with three percent left in cash. The competition's required options component is a separate SPY agent. Its general compiler can construct bullish and bearish debit spreads, while the live contest guard deliberately authorizes only a bullish spread or no trade. Because the allocation and rules were frozen before the scoring window, the forward account records what the system actually does rather than a strategy revised after seeing the result [1].</w:t>
       </w:r>
     </w:p>
     <w:p>
@@ -97,7 +97,7 @@
         <w:widowControl/>
         <w:spacing w:line="276" w:lineRule="auto" w:after="140"/>
         <w:ind w:firstLine="302"/>
-        <w:jc w:val="both"/>
+        <w:jc w:val="left"/>
       </w:pPr>
       <w:r>
         <w:rPr>
@@ -107,7 +107,7 @@
           <w:color w:val="171717"/>
           <w:sz w:val="22"/>
         </w:rPr>
-        <w:t>Finly's separate SPY options workflow turns public news, market observations, option data, event information, and a small prediction-market input into a reviewable decision. A hosted Qwen3-32B model reads only public news. Code then applies freshness, liquidity, payoff, buying-power, and risk limits before it can build a bull-call spread, a bear-put spread, or no trade. A short-lived permit ties the checked evidence and risk calculation to one exact paper order. In the public demonstration, Finly produced a SPY debit spread with a maximum loss of $366 and a maximum gain of $634. The required safety behavior survived all four source-removal checks and all thirty-two input changes [3].</w:t>
+        <w:t>Every options decision follows the same visible path. Finly first gathers time-stamped market prices, option quotes, scheduled events, and public Alpaca news. A hosted Qwen3-32B model reads the public news and identifies support, conflict, and uncertainty. Code then combines the allowed evidence, chooses the direction and spread, fixes the quantity and maximum loss, and runs the risk gates required before trading: data must be fresh, the options must be liquid, the payoff must add up, the account must have enough buying power, and the decision must remain stable when a source is removed or an important input changes. If any check fails, Finly stops. If they all pass, the approval is tied to one exact order, sent to the Alpaca paper-trading API through Alpaca's official MCP server, and read back from Alpaca. The public dashboard then shows the sanitized account result and a receipt explaining why Finly traded—or why it did not [2,3].</w:t>
       </w:r>
     </w:p>
     <w:p>
@@ -116,7 +116,7 @@
         <w:widowControl/>
         <w:spacing w:line="276" w:lineRule="auto" w:after="140"/>
         <w:ind w:firstLine="302"/>
-        <w:jc w:val="both"/>
+        <w:jc w:val="left"/>
       </w:pPr>
       <w:r>
         <w:rPr>
@@ -126,7 +126,7 @@
           <w:color w:val="171717"/>
           <w:sz w:val="22"/>
         </w:rPr>
-        <w:t>The historical case gives a concrete reason to test Finly. In a 2013–2026 simulation with modeled one-way costs of five basis points, $10,000 became $106,711 under G4 and $68,082 under SPY—a $38,629 difference [4]. A fixed 1927–2007 industry replay added an earlier-era check: across 21,218 days, it annualized at 13.37 percent against 9.48 percent, stayed ahead at all twenty-one monthly anchors, retained a 2.45-percentage-point advantage under a twenty-five-basis-point cost stress, and had a maximum drawdown 16.31 percentage points shallower [5,6]. The research gate treated that upside as a reason to test G4, not to promote it statistically. A human then froze the competition allocation, and a separate scorer measures the $100,000 account against its baseline and contemporaneous SPY [1,4,10].</w:t>
+        <w:t>The numbers give judges a reason to test that architecture. In a cost-adjusted historical simulation from January 2013 through August 2026, $10,000 became $106,711 with Finly's G4 rule and $68,082 with SPY—a $38,629 difference in ending wealth. A fixed replay on 21,218 earlier market days produced 13.37 percent annualized growth against 9.48 percent for the market and stayed ahead across all twenty-one possible offsets of its rebalance schedule. The options demonstration then showed the risk process in concrete dollars: one SPY debit spread had a $366 maximum loss and $634 maximum gain, and it survived all four source-removal checks and all thirty-two input changes. Across the repository, 806 automated tests were run: 804 passed, none failed, and two were skipped [2,4]. These historical figures include modeled costs; the live paper result is measured separately from the $100,000 starting balance.</w:t>
       </w:r>
     </w:p>
     <w:p>
@@ -135,7 +135,7 @@
         <w:widowControl/>
         <w:spacing w:line="276" w:lineRule="auto" w:after="140"/>
         <w:ind w:firstLine="302"/>
-        <w:jc w:val="both"/>
+        <w:jc w:val="left"/>
       </w:pPr>
       <w:r>
         <w:rPr>
@@ -145,7 +145,7 @@
           <w:color w:val="171717"/>
           <w:sz w:val="22"/>
         </w:rPr>
-        <w:t>Finly now runs through Alpaca's official MCP server against a dedicated $100,000 paper account. Before an order, the cloud runner checks the account, frozen signal, market session, asset eligibility, cash, and intended amount. It records each intent before submission, reads the broker state back afterward, and uses fixed order identities to avoid duplicates after a lost acknowledgement. Private restart state is encrypted; the public dashboard shows only sanitized account and decision fields [7–9]. The repository's 806 automated tests—804 passing and two skipped in the public run—exercise the calculations, broker translation, restart logic, and safety limits [11]. No replay can settle what the frozen rule will earn next. Finly supplies a public way to learn the answer while keeping the model useful, the risk finite, and every trade open to inspection.</w:t>
+        <w:t>Finly's advantage is not asking an AI to guess harder. It is making every trade earn permission. That gives investors, educators, and brokerage teams clear answers: what did the AI believe, how much could the trade lose, and what did Alpaca accept? It also meets the hackathon on its own terms: meaningful AI logic, explicit risk gates, mandatory options trading, official Alpaca infrastructure, a dedicated competition account, and visible paper P&amp;L. Judges can open the working web app, change the evidence to trigger both trade and no-trade paths, watch the cloud account, inspect the public GitHub repository, and follow the same story in the demo video and pitch deck [5]. Finly does not merely produce a market opinion; it turns that opinion into a checked, limited, and inspectable action.</w:t>
       </w:r>
     </w:p>
     <w:p>
@@ -170,7 +170,7 @@
         <w:widowControl/>
         <w:spacing w:line="240" w:lineRule="auto" w:after="0"/>
         <w:ind w:left="202" w:hanging="202"/>
-        <w:jc w:val="both"/>
+        <w:jc w:val="left"/>
       </w:pPr>
       <w:r>
         <w:rPr>
@@ -190,7 +190,28 @@
             <w:sz w:val="15"/>
             <w:u w:val="single"/>
           </w:rPr>
-          <w:t>Frozen G4 competition protocol</w:t>
+          <w:t>Frozen competition protocol</w:t>
+        </w:r>
+      </w:hyperlink>
+      <w:r>
+        <w:rPr>
+          <w:rFonts w:ascii="Times New Roman" w:hAnsi="Times New Roman" w:eastAsia="Times New Roman"/>
+          <w:b w:val="0"/>
+          <w:i w:val="0"/>
+          <w:color w:val="5F6368"/>
+          <w:sz w:val="15"/>
+        </w:rPr>
+        <w:t xml:space="preserve"> and </w:t>
+      </w:r>
+      <w:hyperlink r:id="rId11">
+        <w:r>
+          <w:rPr>
+            <w:rFonts w:ascii="Times New Roman" w:hAnsi="Times New Roman"/>
+            <w:color w:val="1F5A4C"/>
+            <w:sz w:val="15"/>
+            <w:u w:val="single"/>
+          </w:rPr>
+          <w:t>deployment record</w:t>
         </w:r>
       </w:hyperlink>
       <w:r>
@@ -203,7 +224,7 @@
         </w:rPr>
         <w:t xml:space="preserve">. [2] Finly, </w:t>
       </w:r>
-      <w:hyperlink r:id="rId11">
+      <w:hyperlink r:id="rId12">
         <w:r>
           <w:rPr>
             <w:rFonts w:ascii="Times New Roman" w:hAnsi="Times New Roman"/>
@@ -211,7 +232,7 @@
             <w:sz w:val="15"/>
             <w:u w:val="single"/>
           </w:rPr>
-          <w:t>Frozen G4 source signal</w:t>
+          <w:t>Quantitative evidence</w:t>
         </w:r>
       </w:hyperlink>
       <w:r>
@@ -222,9 +243,9 @@
           <w:color w:val="5F6368"/>
           <w:sz w:val="15"/>
         </w:rPr>
-        <w:t xml:space="preserve">. [3] Finly, </w:t>
+        <w:t xml:space="preserve">, </w:t>
       </w:r>
-      <w:hyperlink r:id="rId12">
+      <w:hyperlink r:id="rId13">
         <w:r>
           <w:rPr>
             <w:rFonts w:ascii="Times New Roman" w:hAnsi="Times New Roman"/>
@@ -232,7 +253,70 @@
             <w:sz w:val="15"/>
             <w:u w:val="single"/>
           </w:rPr>
-          <w:t>Latest options decision receipt</w:t>
+          <w:t>earlier-era replay</w:t>
+        </w:r>
+      </w:hyperlink>
+      <w:r>
+        <w:rPr>
+          <w:rFonts w:ascii="Times New Roman" w:hAnsi="Times New Roman" w:eastAsia="Times New Roman"/>
+          <w:b w:val="0"/>
+          <w:i w:val="0"/>
+          <w:color w:val="5F6368"/>
+          <w:sz w:val="15"/>
+        </w:rPr>
+        <w:t xml:space="preserve">, and </w:t>
+      </w:r>
+      <w:hyperlink r:id="rId14">
+        <w:r>
+          <w:rPr>
+            <w:rFonts w:ascii="Times New Roman" w:hAnsi="Times New Roman"/>
+            <w:color w:val="1F5A4C"/>
+            <w:sz w:val="15"/>
+            <w:u w:val="single"/>
+          </w:rPr>
+          <w:t>options decision receipt</w:t>
+        </w:r>
+      </w:hyperlink>
+      <w:r>
+        <w:rPr>
+          <w:rFonts w:ascii="Times New Roman" w:hAnsi="Times New Roman" w:eastAsia="Times New Roman"/>
+          <w:b w:val="0"/>
+          <w:i w:val="0"/>
+          <w:color w:val="5F6368"/>
+          <w:sz w:val="15"/>
+        </w:rPr>
+        <w:t xml:space="preserve">. [3] Alpaca, </w:t>
+      </w:r>
+      <w:hyperlink r:id="rId15">
+        <w:r>
+          <w:rPr>
+            <w:rFonts w:ascii="Times New Roman" w:hAnsi="Times New Roman"/>
+            <w:color w:val="1F5A4C"/>
+            <w:sz w:val="15"/>
+            <w:u w:val="single"/>
+          </w:rPr>
+          <w:t>official MCP server</w:t>
+        </w:r>
+      </w:hyperlink>
+      <w:r>
+        <w:rPr>
+          <w:rFonts w:ascii="Times New Roman" w:hAnsi="Times New Roman" w:eastAsia="Times New Roman"/>
+          <w:b w:val="0"/>
+          <w:i w:val="0"/>
+          <w:color w:val="5F6368"/>
+          <w:sz w:val="15"/>
+        </w:rPr>
+        <w:t xml:space="preserve">; Finly, </w:t>
+      </w:r>
+      <w:hyperlink r:id="rId16">
+        <w:r>
+          <w:rPr>
+            <w:rFonts w:ascii="Times New Roman" w:hAnsi="Times New Roman"/>
+            <w:color w:val="1F5A4C"/>
+            <w:sz w:val="15"/>
+            <w:u w:val="single"/>
+          </w:rPr>
+          <w:t>cloud runner design</w:t>
         </w:r>
       </w:hyperlink>
       <w:r>
@@ -245,7 +329,7 @@
         </w:rPr>
         <w:t xml:space="preserve">. [4] Finly, </w:t>
       </w:r>
-      <w:hyperlink r:id="rId13">
+      <w:hyperlink r:id="rId17">
         <w:r>
           <w:rPr>
             <w:rFonts w:ascii="Times New Roman" w:hAnsi="Times New Roman"/>
@@ -253,7 +337,7 @@
             <w:sz w:val="15"/>
             <w:u w:val="single"/>
           </w:rPr>
-          <w:t>Quantitative release gate</w:t>
+          <w:t>public automated-test run</w:t>
         </w:r>
       </w:hyperlink>
       <w:r>
@@ -264,9 +348,9 @@
           <w:color w:val="5F6368"/>
           <w:sz w:val="15"/>
         </w:rPr>
-        <w:t xml:space="preserve">. [5] Kenneth R. French, </w:t>
+        <w:t xml:space="preserve">. [5] Finly, </w:t>
       </w:r>
-      <w:hyperlink r:id="rId14">
+      <w:hyperlink r:id="rId18">
         <w:r>
           <w:rPr>
             <w:rFonts w:ascii="Times New Roman" w:hAnsi="Times New Roman"/>
@@ -274,7 +358,7 @@
             <w:sz w:val="15"/>
             <w:u w:val="single"/>
           </w:rPr>
-          <w:t>Data Library</w:t>
+          <w:t>live application</w:t>
         </w:r>
       </w:hyperlink>
       <w:r>
@@ -285,9 +369,9 @@
           <w:color w:val="5F6368"/>
           <w:sz w:val="15"/>
         </w:rPr>
-        <w:t xml:space="preserve">. [6] Finly, </w:t>
+        <w:t xml:space="preserve">, </w:t>
       </w:r>
-      <w:hyperlink r:id="rId15">
+      <w:hyperlink r:id="rId19">
         <w:r>
           <w:rPr>
             <w:rFonts w:ascii="Times New Roman" w:hAnsi="Times New Roman"/>
@@ -295,7 +379,7 @@
             <w:sz w:val="15"/>
             <w:u w:val="single"/>
           </w:rPr>
-          <w:t>External-era public evidence</w:t>
+          <w:t>public repository</w:t>
         </w:r>
       </w:hyperlink>
       <w:r>
@@ -306,9 +390,9 @@
           <w:color w:val="5F6368"/>
           <w:sz w:val="15"/>
         </w:rPr>
-        <w:t xml:space="preserve">. [7] Alpaca, </w:t>
+        <w:t xml:space="preserve">, </w:t>
       </w:r>
-      <w:hyperlink r:id="rId16">
+      <w:hyperlink r:id="rId20">
         <w:r>
           <w:rPr>
             <w:rFonts w:ascii="Times New Roman" w:hAnsi="Times New Roman"/>
@@ -316,7 +400,7 @@
             <w:sz w:val="15"/>
             <w:u w:val="single"/>
           </w:rPr>
-          <w:t>MCP Server</w:t>
+          <w:t>demo video</w:t>
         </w:r>
       </w:hyperlink>
       <w:r>
@@ -327,9 +411,9 @@
           <w:color w:val="5F6368"/>
           <w:sz w:val="15"/>
         </w:rPr>
-        <w:t xml:space="preserve">. [8] Finly, </w:t>
+        <w:t xml:space="preserve">, and </w:t>
       </w:r>
-      <w:hyperlink r:id="rId17">
+      <w:hyperlink r:id="rId21">
         <w:r>
           <w:rPr>
             <w:rFonts w:ascii="Times New Roman" w:hAnsi="Times New Roman"/>
@@ -337,70 +421,7 @@
             <w:sz w:val="15"/>
             <w:u w:val="single"/>
           </w:rPr>
-          <w:t>Cloud runner and restart design</w:t>
-        </w:r>
-      </w:hyperlink>
-      <w:r>
-        <w:rPr>
-          <w:rFonts w:ascii="Times New Roman" w:hAnsi="Times New Roman" w:eastAsia="Times New Roman"/>
-          <w:b w:val="0"/>
-          <w:i w:val="0"/>
-          <w:color w:val="5F6368"/>
-          <w:sz w:val="15"/>
-        </w:rPr>
-        <w:t xml:space="preserve">. [9] Finly, </w:t>
-      </w:r>
-      <w:hyperlink r:id="rId18">
-        <w:r>
-          <w:rPr>
-            <w:rFonts w:ascii="Times New Roman" w:hAnsi="Times New Roman"/>
-            <w:color w:val="1F5A4C"/>
-            <w:sz w:val="15"/>
-            <w:u w:val="single"/>
-          </w:rPr>
-          <w:t>Sanitized competition account snapshot</w:t>
-        </w:r>
-      </w:hyperlink>
-      <w:r>
-        <w:rPr>
-          <w:rFonts w:ascii="Times New Roman" w:hAnsi="Times New Roman" w:eastAsia="Times New Roman"/>
-          <w:b w:val="0"/>
-          <w:i w:val="0"/>
-          <w:color w:val="5F6368"/>
-          <w:sz w:val="15"/>
-        </w:rPr>
-        <w:t xml:space="preserve">. [10] Finly, </w:t>
-      </w:r>
-      <w:hyperlink r:id="rId19">
-        <w:r>
-          <w:rPr>
-            <w:rFonts w:ascii="Times New Roman" w:hAnsi="Times New Roman"/>
-            <w:color w:val="1F5A4C"/>
-            <w:sz w:val="15"/>
-            <w:u w:val="single"/>
-          </w:rPr>
-          <w:t>Competition forward-profit contract</w:t>
-        </w:r>
-      </w:hyperlink>
-      <w:r>
-        <w:rPr>
-          <w:rFonts w:ascii="Times New Roman" w:hAnsi="Times New Roman" w:eastAsia="Times New Roman"/>
-          <w:b w:val="0"/>
-          <w:i w:val="0"/>
-          <w:color w:val="5F6368"/>
-          <w:sz w:val="15"/>
-        </w:rPr>
-        <w:t xml:space="preserve">. [11] Finly, </w:t>
-      </w:r>
-      <w:hyperlink r:id="rId20">
-        <w:r>
-          <w:rPr>
-            <w:rFonts w:ascii="Times New Roman" w:hAnsi="Times New Roman"/>
-            <w:color w:val="1F5A4C"/>
-            <w:sz w:val="15"/>
-            <w:u w:val="single"/>
-          </w:rPr>
-          <w:t>Public automated-test run</w:t>
+          <w:t>pitch deck</w:t>
         </w:r>
       </w:hyperlink>
       <w:r>

</xml_diff>

<commit_message>
feat: publish verified first-close submission package
</commit_message>
<xml_diff>
--- a/public/judge/Finly_Judge_Proposal.docx
+++ b/public/judge/Finly_Judge_Proposal.docx
@@ -126,7 +126,7 @@
           <w:color w:val="171717"/>
           <w:sz w:val="22"/>
         </w:rPr>
-        <w:t>The numbers give judges a reason to test that architecture. In a cost-adjusted historical simulation from January 2013 through August 2026, $10,000 became $106,711 with Finly's G4 rule and $68,082 with SPY—a $38,629 difference in ending wealth. A fixed replay on 21,218 earlier market days produced 13.37 percent annualized growth against 9.48 percent for the market and stayed ahead across all twenty-one possible offsets of its rebalance schedule. The options demonstration then showed the risk process in concrete dollars: one SPY debit spread had a $366 maximum loss and $634 maximum gain, and it survived all four source-removal checks and all thirty-two input changes. Across the repository, 806 automated tests were run: 804 passed, none failed, and two were skipped [2,4]. These historical figures include modeled costs; the live paper result is measured separately from the $100,000 starting balance.</w:t>
+        <w:t>The numbers give judges a reason to test that architecture. In a cost-adjusted historical simulation from January 2013 through August 2026, $10,000 became $106,711 with Finly's G4 rule and $68,082 with SPY—a $38,629 difference in ending wealth. A fixed replay on 21,218 earlier market days produced 13.37 percent annualized growth against 9.48 percent for the market and stayed ahead across all twenty-one possible offsets of its rebalance schedule. The options demonstration showed the risk in concrete dollars: one SPY debit spread had a $366 maximum loss and $634 maximum gain, and survived all four source-removal checks and all thirty-two input changes. The public suite ran 809 tests: 807 passed, none failed, and two were skipped [2,4]. At the first close, Finly was up $95.32 while same-clock SPY was down $57.99—a $153.31 advantage after 15 fills and with no external cashflows [2].</w:t>
       </w:r>
     </w:p>
     <w:p>
@@ -264,7 +264,7 @@
           <w:color w:val="5F6368"/>
           <w:sz w:val="15"/>
         </w:rPr>
-        <w:t xml:space="preserve">, and </w:t>
+        <w:t xml:space="preserve">, </w:t>
       </w:r>
       <w:hyperlink r:id="rId14">
         <w:r>
@@ -285,9 +285,30 @@
           <w:color w:val="5F6368"/>
           <w:sz w:val="15"/>
         </w:rPr>
+        <w:t xml:space="preserve">, and </w:t>
+      </w:r>
+      <w:hyperlink r:id="rId15">
+        <w:r>
+          <w:rPr>
+            <w:rFonts w:ascii="Times New Roman" w:hAnsi="Times New Roman"/>
+            <w:color w:val="1F5A4C"/>
+            <w:sz w:val="15"/>
+            <w:u w:val="single"/>
+          </w:rPr>
+          <w:t>first-close measurement</w:t>
+        </w:r>
+      </w:hyperlink>
+      <w:r>
+        <w:rPr>
+          <w:rFonts w:ascii="Times New Roman" w:hAnsi="Times New Roman" w:eastAsia="Times New Roman"/>
+          <w:b w:val="0"/>
+          <w:i w:val="0"/>
+          <w:color w:val="5F6368"/>
+          <w:sz w:val="15"/>
+        </w:rPr>
         <w:t xml:space="preserve">. [3] Alpaca, </w:t>
       </w:r>
-      <w:hyperlink r:id="rId15">
+      <w:hyperlink r:id="rId16">
         <w:r>
           <w:rPr>
             <w:rFonts w:ascii="Times New Roman" w:hAnsi="Times New Roman"/>
@@ -308,7 +329,7 @@
         </w:rPr>
         <w:t xml:space="preserve">; Finly, </w:t>
       </w:r>
-      <w:hyperlink r:id="rId16">
+      <w:hyperlink r:id="rId17">
         <w:r>
           <w:rPr>
             <w:rFonts w:ascii="Times New Roman" w:hAnsi="Times New Roman"/>
@@ -329,7 +350,7 @@
         </w:rPr>
         <w:t xml:space="preserve">. [4] Finly, </w:t>
       </w:r>
-      <w:hyperlink r:id="rId17">
+      <w:hyperlink r:id="rId18">
         <w:r>
           <w:rPr>
             <w:rFonts w:ascii="Times New Roman" w:hAnsi="Times New Roman"/>
@@ -350,7 +371,7 @@
         </w:rPr>
         <w:t xml:space="preserve">. [5] Finly, </w:t>
       </w:r>
-      <w:hyperlink r:id="rId18">
+      <w:hyperlink r:id="rId19">
         <w:r>
           <w:rPr>
             <w:rFonts w:ascii="Times New Roman" w:hAnsi="Times New Roman"/>
@@ -371,7 +392,7 @@
         </w:rPr>
         <w:t xml:space="preserve">, </w:t>
       </w:r>
-      <w:hyperlink r:id="rId19">
+      <w:hyperlink r:id="rId20">
         <w:r>
           <w:rPr>
             <w:rFonts w:ascii="Times New Roman" w:hAnsi="Times New Roman"/>
@@ -392,7 +413,7 @@
         </w:rPr>
         <w:t xml:space="preserve">, </w:t>
       </w:r>
-      <w:hyperlink r:id="rId20">
+      <w:hyperlink r:id="rId21">
         <w:r>
           <w:rPr>
             <w:rFonts w:ascii="Times New Roman" w:hAnsi="Times New Roman"/>
@@ -413,7 +434,7 @@
         </w:rPr>
         <w:t xml:space="preserve">, and </w:t>
       </w:r>
-      <w:hyperlink r:id="rId21">
+      <w:hyperlink r:id="rId22">
         <w:r>
           <w:rPr>
             <w:rFonts w:ascii="Times New Roman" w:hAnsi="Times New Roman"/>

</xml_diff>

<commit_message>
Clarify Finly for public and technical judges
</commit_message>
<xml_diff>
--- a/public/judge/Finly_Judge_Proposal.docx
+++ b/public/judge/Finly_Judge_Proposal.docx
@@ -13,7 +13,7 @@
           <w:b/>
           <w:i w:val="0"/>
           <w:color w:val="171717"/>
-          <w:sz w:val="37"/>
+          <w:sz w:val="35"/>
         </w:rPr>
         <w:t>Finly: The AI Trading Agent That Shows Its Work</w:t>
       </w:r>
@@ -57,7 +57,7 @@
       <w:pPr>
         <w:keepLines/>
         <w:widowControl/>
-        <w:spacing w:line="276" w:lineRule="auto" w:after="140"/>
+        <w:spacing w:line="259" w:lineRule="auto" w:after="100"/>
         <w:ind w:firstLine="0"/>
         <w:jc w:val="left"/>
       </w:pPr>
@@ -67,16 +67,16 @@
           <w:b w:val="0"/>
           <w:i w:val="0"/>
           <w:color w:val="171717"/>
-          <w:sz w:val="22"/>
+          <w:sz w:val="20"/>
         </w:rPr>
-        <w:t>Finly is an AI trading agent that shows its work before it risks a dollar. Most trading agents ask one model to read the market, choose a position, size it, and send the order. Finly separates those jobs. AI interprets public evidence and explains support or conflict; code controls direction, contracts, position size, maximum loss, and every field sent to Alpaca. Investors get the speed of AI without handing a language model unrestricted control of a brokerage account.</w:t>
+        <w:t>Finly is an AI trading agent that shows its work before it risks a dollar. Most trading agents ask one model to read the market, choose a position, size it, and send the order. Finly separates those jobs. AI reviews public information and explains what supports or weakens a trade; fixed, tested code controls the direction, contracts, position size, maximum loss, and every field sent to Alpaca. The AI may lower confidence or stop a trade, but it cannot increase the amount at risk. Investors get the speed of AI without handing a language model unrestricted control of a brokerage account.</w:t>
       </w:r>
     </w:p>
     <w:p>
       <w:pPr>
         <w:keepLines/>
         <w:widowControl/>
-        <w:spacing w:line="276" w:lineRule="auto" w:after="140"/>
+        <w:spacing w:line="259" w:lineRule="auto" w:after="100"/>
         <w:ind w:firstLine="302"/>
         <w:jc w:val="left"/>
       </w:pPr>
@@ -86,16 +86,16 @@
           <w:b w:val="0"/>
           <w:i w:val="0"/>
           <w:color w:val="171717"/>
-          <w:sz w:val="22"/>
+          <w:sz w:val="20"/>
         </w:rPr>
-        <w:t>For this hackathon, Finly runs in the cloud against a dedicated, verified $100,000 Alpaca paper account. A frozen four-fund equity allocation provides the portfolio base: QQQ plus three sector funds selected before the opening bell by a transparent momentum rule, with three percent left in cash. The competition's required options component is a separate SPY agent. Its general compiler can construct bullish and bearish debit spreads, while the live contest guard deliberately authorizes only a bullish spread or no trade. Because the allocation and rules were frozen before the scoring window, the forward account records what the system actually does rather than a strategy revised after seeing the result [1].</w:t>
+        <w:t>For this hackathon, Finly runs in the cloud against a dedicated, verified $100,000 Alpaca paper account, which follows real prices with virtual money. The product has two parts. Finly Core is the base portfolio: 48.5 percent in QQQ, a fund that tracks the Nasdaq-100; 48.5 percent divided across three sector funds chosen by a transparent price-trend rule; and 3 percent in cash. Finly Options is a separate SPY assistant. SPY tracks the S&amp;P 500. Its general code can build rising- and falling-price two-option plans with fixed maximum loss, while the live competition rules allow only an approved rising-price trade or no trade. We locked the portfolio and rules before the test began, so the account could not be revised after seeing the result [1].</w:t>
       </w:r>
     </w:p>
     <w:p>
       <w:pPr>
         <w:keepLines/>
         <w:widowControl/>
-        <w:spacing w:line="276" w:lineRule="auto" w:after="140"/>
+        <w:spacing w:line="259" w:lineRule="auto" w:after="100"/>
         <w:ind w:firstLine="302"/>
         <w:jc w:val="left"/>
       </w:pPr>
@@ -105,16 +105,16 @@
           <w:b w:val="0"/>
           <w:i w:val="0"/>
           <w:color w:val="171717"/>
-          <w:sz w:val="22"/>
+          <w:sz w:val="20"/>
         </w:rPr>
-        <w:t>Every options decision follows the same visible path. Finly first gathers time-stamped market prices, option quotes, scheduled events, and public Alpaca news. A hosted Qwen3-32B model reads the public news and identifies support, conflict, and uncertainty. Code then combines the allowed evidence, chooses the direction and spread, fixes the quantity and maximum loss, and runs the risk gates required before trading: data must be fresh, the options must be liquid, the payoff must add up, the account must have enough buying power, and the decision must remain stable when a source is removed or an important input changes. If any check fails, Finly stops. If they all pass, the approval is tied to one exact order, sent to the Alpaca paper-trading API through Alpaca's official MCP server, and read back from Alpaca. The public dashboard then shows the sanitized account result and a receipt explaining why Finly traded—or why it did not [2,3].</w:t>
+        <w:t>Every live options decision follows the same visible path. Finly gathers current market prices, option quotes, and public Alpaca news. A hosted Qwen3-32B model reads the news and identifies support, conflict, and uncertainty. Code then chooses the direction and two-option trade, fixes the quantity and maximum loss, and runs the required checks: data must be current, the options must have enough market activity to trade, the payoff must add up, the account must have enough buying power, and the decision must remain stable when a source is removed or an important input changes. If any check fails, Finly stops. If they all pass, the approval is tied to one exact order, sent through Alpaca's official connection, and checked against the paper account afterward. The public dashboard then shows a safe account summary and a saved decision record explaining why Finly traded—or why it did not [2,3].</w:t>
       </w:r>
     </w:p>
     <w:p>
       <w:pPr>
         <w:keepLines/>
         <w:widowControl/>
-        <w:spacing w:line="276" w:lineRule="auto" w:after="140"/>
+        <w:spacing w:line="259" w:lineRule="auto" w:after="100"/>
         <w:ind w:firstLine="302"/>
         <w:jc w:val="left"/>
       </w:pPr>
@@ -124,16 +124,16 @@
           <w:b w:val="0"/>
           <w:i w:val="0"/>
           <w:color w:val="171717"/>
-          <w:sz w:val="22"/>
+          <w:sz w:val="20"/>
         </w:rPr>
-        <w:t>The numbers give judges a reason to test that architecture. In a cost-adjusted historical simulation from January 2013 through August 2026, $10,000 became $106,711 with Finly's G4 rule and $68,082 with SPY—a $38,629 difference in ending wealth. A fixed replay on 21,218 earlier market days produced 13.37 percent annualized growth against 9.48 percent for the market and stayed ahead across all twenty-one possible offsets of its rebalance schedule. The options demonstration showed the risk in concrete dollars: one SPY debit spread had a $366 maximum loss and $634 maximum gain, and survived all four source-removal checks and all thirty-two input changes. The public suite ran 809 tests: 807 passed, none failed, and two were skipped [2,4]. At the first close, Finly was up $95.32 while same-clock SPY was down $57.99—a $153.31 advantage after 15 fills and with no external cashflows [2].</w:t>
+        <w:t>The numbers give judges a reason to test that architecture. In a historical simulation from January 2013 through August 2026, with modeled trading costs, $10,000 became $106,711 with Finly Core and $68,082 with SPY—a $38,629 difference in ending wealth. A simpler industry version was checked on 21,218 earlier market days. It averaged 13.37 percent growth per year against 9.48 percent for the market and stayed ahead in all twenty-one tests that changed which trading day of the month the holdings were updated. The interactive options demonstration made the risk concrete: one illustrative SPY plan had a $366 maximum loss and $634 maximum gain, and reached the same decision after all four sources were removed one at a time and after thirty-two input changes. No broker order or fill occurred. The public suite ran 809 tests: 807 passed, none failed, and two were skipped [2,4]. At the first 4:00 p.m. close, Finly Core was up $95.32 while SPY was down $57.99 from the same starting point—a $153.31 advantage after 15 broker fill events and with no deposits or withdrawals. No options position was open at that close [2].</w:t>
       </w:r>
     </w:p>
     <w:p>
       <w:pPr>
         <w:keepLines/>
         <w:widowControl/>
-        <w:spacing w:line="276" w:lineRule="auto" w:after="140"/>
+        <w:spacing w:line="259" w:lineRule="auto" w:after="100"/>
         <w:ind w:firstLine="302"/>
         <w:jc w:val="left"/>
       </w:pPr>
@@ -143,9 +143,9 @@
           <w:b w:val="0"/>
           <w:i w:val="0"/>
           <w:color w:val="171717"/>
-          <w:sz w:val="22"/>
+          <w:sz w:val="20"/>
         </w:rPr>
-        <w:t>Finly's advantage is not asking an AI to guess harder. It is making every trade earn permission. That gives investors, educators, and brokerage teams clear answers: what did the AI believe, how much could the trade lose, and what did Alpaca accept? It also meets the hackathon on its own terms: meaningful AI logic, explicit risk gates, mandatory options trading, official Alpaca infrastructure, a dedicated competition account, and visible paper P&amp;L. Judges can open the working web app, change the evidence to trigger both trade and no-trade paths, watch the cloud account, inspect the public GitHub repository, and follow the same story in the demo video and pitch deck [5]. Finly does not merely produce a market opinion; it turns that opinion into a checked, limited, and inspectable action.</w:t>
+        <w:t>Finly's advantage is not asking an AI to guess harder. It is making every trade earn approval. That gives investors, educators, and brokerage teams clear answers: what did the AI believe, how much could the trade lose, and what did Alpaca accept? It also meets the hackathon on its own terms: meaningful AI logic, explicit risk checks, the required options component, official Alpaca infrastructure, a dedicated competition account, and visible paper-account results. Judges can open the working web app, replay both the trade and no-trade demonstrations, watch the cloud account, inspect the public GitHub repository, and follow the same story in the demo video and pitch deck [5]. Finly does not merely produce a market opinion; it turns that opinion into a checked, limited, and inspectable action.</w:t>
       </w:r>
     </w:p>
     <w:p>
@@ -459,7 +459,7 @@
     <w:sectPr>
       <w:footerReference w:type="default" r:id="rId9"/>
       <w:pgSz w:w="12240" w:h="15840"/>
-      <w:pgMar w:top="979" w:right="1267" w:bottom="893" w:left="1267" w:header="432" w:footer="432" w:gutter="0"/>
+      <w:pgMar w:top="835" w:right="1181" w:bottom="749" w:left="1181" w:header="432" w:footer="432" w:gutter="0"/>
       <w:cols w:space="720"/>
       <w:docGrid w:linePitch="360"/>
     </w:sectPr>
@@ -858,12 +858,12 @@
     <w:rsid w:val="00FC693F"/>
     <w:pPr>
       <w:widowControl/>
-      <w:spacing w:before="0" w:after="140" w:line="276" w:lineRule="auto"/>
+      <w:spacing w:before="0" w:after="100" w:line="259" w:lineRule="auto"/>
     </w:pPr>
     <w:rPr>
       <w:rFonts w:ascii="Times New Roman" w:hAnsi="Times New Roman" w:eastAsia="Times New Roman"/>
       <w:color w:val="171717"/>
-      <w:sz w:val="22"/>
+      <w:sz w:val="20"/>
     </w:rPr>
   </w:style>
   <w:style w:type="paragraph" w:styleId="Header">

</xml_diff>

<commit_message>
Make Finly accessible to public and technical judges
</commit_message>
<xml_diff>
--- a/public/judge/Finly_Judge_Proposal.docx
+++ b/public/judge/Finly_Judge_Proposal.docx
@@ -15,7 +15,7 @@
           <w:color w:val="171717"/>
           <w:sz w:val="35"/>
         </w:rPr>
-        <w:t>Finly: The AI Trading Agent That Shows Its Work</w:t>
+        <w:t>Finly: AI Explains the Trade. Code Controls the Money.</w:t>
       </w:r>
     </w:p>
     <w:p>
@@ -69,7 +69,7 @@
           <w:color w:val="171717"/>
           <w:sz w:val="20"/>
         </w:rPr>
-        <w:t>Finly is an AI trading agent that shows its work before it risks a dollar. Most trading agents ask one model to read the market, choose a position, size it, and send the order. Finly separates those jobs. AI reviews public information and explains what supports or weakens a trade; fixed, tested code controls the direction, contracts, position size, maximum loss, and every field sent to Alpaca. The AI may lower confidence or stop a trade, but it cannot increase the amount at risk. Investors get the speed of AI without handing a language model unrestricted control of a brokerage account.</w:t>
+        <w:t>Finly is a paper-trading bot that lets AI study the market without giving it control of the account. Paper trading follows real prices with virtual money. In Finly's first session on a dedicated $100,000 Alpaca paper account, the portfolio gained $95.32 while SPY—the fund commonly used to represent the S&amp;P 500—lost $57.99 from the same starting point. Finly therefore finished the session $153.31 ahead. Alpaca recorded fifteen completed buy-or-sell fills as the portfolio was assembled, with no deposits, withdrawals, or options held at that close [1]. One session cannot establish future performance, but it does show that Finly moved from an idea to a running system with a result that judges can inspect.</w:t>
       </w:r>
     </w:p>
     <w:p>
@@ -88,7 +88,7 @@
           <w:color w:val="171717"/>
           <w:sz w:val="20"/>
         </w:rPr>
-        <w:t>For this hackathon, Finly runs in the cloud against a dedicated, verified $100,000 Alpaca paper account, which follows real prices with virtual money. The product has two parts. Finly Core is the base portfolio: 48.5 percent in QQQ, a fund that tracks the Nasdaq-100; 48.5 percent divided across three sector funds chosen by a transparent price-trend rule; and 3 percent in cash. Finly Options is a separate SPY assistant. SPY tracks the S&amp;P 500. Its general code can build rising- and falling-price two-option plans with fixed maximum loss, while the live competition rules allow only an approved rising-price trade or no trade. We locked the portfolio and rules before the test began, so the account could not be revised after seeing the result [1].</w:t>
+        <w:t>Finly is one product built around a clear division of responsibility. Its rules-based portfolio keeps 48.5 percent in QQQ, which tracks the Nasdaq-100; divides another 48.5 percent among three sector funds with stronger longer-term price trends; and holds 3 percent in cash. When the evidence supports it, Finly can also consider one small trade tied to SPY using options—time-limited contracts whose value depends on SPY's price. A hosted AI model (Qwen3-32B) reads public Alpaca news and explains what supports the trade, what argues against it, and what remains uncertain. The model does not choose how much money to risk or write the broker order. Fixed, tested code chooses the direction, contracts, quantity, maximum loss, and every field sent to Alpaca. The competition limit is $500 of maximum possible loss per options trade. AI can make Finly more cautious or stop a trade; it cannot raise that limit. We fixed the portfolio and competition rules before the paper test began, so they could not be revised after seeing the result [2].</w:t>
       </w:r>
     </w:p>
     <w:p>
@@ -107,7 +107,7 @@
           <w:color w:val="171717"/>
           <w:sz w:val="20"/>
         </w:rPr>
-        <w:t>Every live options decision follows the same visible path. Finly gathers current market prices, option quotes, and public Alpaca news. A hosted Qwen3-32B model reads the news and identifies support, conflict, and uncertainty. Code then chooses the direction and two-option trade, fixes the quantity and maximum loss, and runs the required checks: data must be current, the options must have enough market activity to trade, the payoff must add up, the account must have enough buying power, and the decision must remain stable when a source is removed or an important input changes. If any check fails, Finly stops. If they all pass, the approval is tied to one exact order, sent through Alpaca's official connection, and checked against the paper account afterward. The public dashboard then shows a safe account summary and a saved decision record explaining why Finly traded—or why it did not [2,3].</w:t>
+        <w:t>Every options decision follows the same visible path. Finly records current fund prices, current prices for the options, trading activity, and public Alpaca news. The model explains the evidence; code builds an exact pair of options and checks that the data are current, the contracts are actively traded, the possible gain and loss are calculated correctly, and the virtual account has enough capacity. Finly then repeats the decision after removing information sources and changing important inputs. A failed check means no trade. A successful approval is tied to one exact order, sent through Alpaca's official connection, and checked against the paper account afterward. The cloud runner saves its progress before each action, so a restart cannot silently create a second order. The public dashboard reports a safe account summary and the saved reason for trading—or staying out [1,3].</w:t>
       </w:r>
     </w:p>
     <w:p>
@@ -126,7 +126,7 @@
           <w:color w:val="171717"/>
           <w:sz w:val="20"/>
         </w:rPr>
-        <w:t>The numbers give judges a reason to test that architecture. In a historical simulation from January 2013 through August 2026, with modeled trading costs, $10,000 became $106,711 with Finly Core and $68,082 with SPY—a $38,629 difference in ending wealth. A simpler industry version was checked on 21,218 earlier market days. It averaged 13.37 percent growth per year against 9.48 percent for the market and stayed ahead in all twenty-one tests that changed which trading day of the month the holdings were updated. The interactive options demonstration made the risk concrete: one illustrative SPY plan had a $366 maximum loss and $634 maximum gain, and reached the same decision after all four sources were removed one at a time and after thirty-two input changes. No broker order or fill occurred. The public suite ran 809 tests: 807 passed, none failed, and two were skipped [2,4]. At the first 4:00 p.m. close, Finly Core was up $95.32 while SPY was down $57.99 from the same starting point—a $153.31 advantage after 15 broker fill events and with no deposits or withdrawals. No options position was open at that close [2].</w:t>
+        <w:t>The historical evidence provides a longer test of the portfolio rule. In a January 2013–August 2026 simulation after modeled trading costs, $10,000 became $106,711 with Finly and $68,082 with SPY, a $38,629 difference in ending wealth. A simpler version built from long-running industry data was tested on 21,218 market days from 1927 through 2007. It averaged 13.37 percent growth per year versus 9.48 percent for the market, remained ahead in all twenty-one tests that changed the monthly update day, and stayed ahead when the assumed trading cost increased fivefold. The interactive options demonstration made the risk controls equally concrete: one illustrative SPY plan had a $366 maximum loss and $634 maximum gain. Finly kept the same decision after removing each of four sources in turn and after thirty-two small input changes; when the evidence conflicted, its checks did not authorize a trade. No broker order or fill occurred in the demonstration [2]. The public verification run found 809 automated tests: 807 passed, none failed, and two were skipped [4].</w:t>
       </w:r>
     </w:p>
     <w:p>
@@ -145,7 +145,7 @@
           <w:color w:val="171717"/>
           <w:sz w:val="20"/>
         </w:rPr>
-        <w:t>Finly's advantage is not asking an AI to guess harder. It is making every trade earn approval. That gives investors, educators, and brokerage teams clear answers: what did the AI believe, how much could the trade lose, and what did Alpaca accept? It also meets the hackathon on its own terms: meaningful AI logic, explicit risk checks, the required options component, official Alpaca infrastructure, a dedicated competition account, and visible paper-account results. Judges can open the working web app, replay both the trade and no-trade demonstrations, watch the cloud account, inspect the public GitHub repository, and follow the same story in the demo video and pitch deck [5]. Finly does not merely produce a market opinion; it turns that opinion into a checked, limited, and inspectable action.</w:t>
+        <w:t>Finly does not try to win by asking an AI to sound more certain. It makes every investment idea pass through software that can explain the evidence, limit the loss, and leave the account untouched. That distinction is useful to an ordinary visitor, who can see what Finly bought and whether it made money, and to a technical judge, who can trace the same decision through the model output, risk calculation, broker order, and account read-back. The project satisfies the hackathon's options requirement while using Alpaca's official infrastructure, a dedicated competition account, meaningful AI analysis, explicit risk checks, and visible paper-account results. Judges can open the working application, replay both an approval and a safety stop, inspect the public repository, reproduce the historical tests, and follow the mathematical and engineering arguments in the linked technical documents [5].</w:t>
       </w:r>
     </w:p>
     <w:p>
@@ -190,7 +190,7 @@
             <w:sz w:val="15"/>
             <w:u w:val="single"/>
           </w:rPr>
-          <w:t>Frozen competition protocol</w:t>
+          <w:t>first-close measurement</w:t>
         </w:r>
       </w:hyperlink>
       <w:r>
@@ -201,7 +201,7 @@
           <w:color w:val="5F6368"/>
           <w:sz w:val="15"/>
         </w:rPr>
-        <w:t xml:space="preserve"> and </w:t>
+        <w:t xml:space="preserve">, </w:t>
       </w:r>
       <w:hyperlink r:id="rId11">
         <w:r>
@@ -211,7 +211,28 @@
             <w:sz w:val="15"/>
             <w:u w:val="single"/>
           </w:rPr>
-          <w:t>deployment record</w:t>
+          <w:t>competition deployment record</w:t>
+        </w:r>
+      </w:hyperlink>
+      <w:r>
+        <w:rPr>
+          <w:rFonts w:ascii="Times New Roman" w:hAnsi="Times New Roman" w:eastAsia="Times New Roman"/>
+          <w:b w:val="0"/>
+          <w:i w:val="0"/>
+          <w:color w:val="5F6368"/>
+          <w:sz w:val="15"/>
+        </w:rPr>
+        <w:t xml:space="preserve">, and </w:t>
+      </w:r>
+      <w:hyperlink r:id="rId12">
+        <w:r>
+          <w:rPr>
+            <w:rFonts w:ascii="Times New Roman" w:hAnsi="Times New Roman"/>
+            <w:color w:val="1F5A4C"/>
+            <w:sz w:val="15"/>
+            <w:u w:val="single"/>
+          </w:rPr>
+          <w:t>latest options decision receipt</w:t>
         </w:r>
       </w:hyperlink>
       <w:r>
@@ -224,27 +245,6 @@
         </w:rPr>
         <w:t xml:space="preserve">. [2] Finly, </w:t>
       </w:r>
-      <w:hyperlink r:id="rId12">
-        <w:r>
-          <w:rPr>
-            <w:rFonts w:ascii="Times New Roman" w:hAnsi="Times New Roman"/>
-            <w:color w:val="1F5A4C"/>
-            <w:sz w:val="15"/>
-            <w:u w:val="single"/>
-          </w:rPr>
-          <w:t>Quantitative evidence</w:t>
-        </w:r>
-      </w:hyperlink>
-      <w:r>
-        <w:rPr>
-          <w:rFonts w:ascii="Times New Roman" w:hAnsi="Times New Roman" w:eastAsia="Times New Roman"/>
-          <w:b w:val="0"/>
-          <w:i w:val="0"/>
-          <w:color w:val="5F6368"/>
-          <w:sz w:val="15"/>
-        </w:rPr>
-        <w:t xml:space="preserve">, </w:t>
-      </w:r>
       <w:hyperlink r:id="rId13">
         <w:r>
           <w:rPr>
@@ -253,7 +253,7 @@
             <w:sz w:val="15"/>
             <w:u w:val="single"/>
           </w:rPr>
-          <w:t>earlier-era replay</w:t>
+          <w:t>frozen competition protocol</w:t>
         </w:r>
       </w:hyperlink>
       <w:r>
@@ -274,7 +274,7 @@
             <w:sz w:val="15"/>
             <w:u w:val="single"/>
           </w:rPr>
-          <w:t>options decision receipt</w:t>
+          <w:t>quantitative evidence</w:t>
         </w:r>
       </w:hyperlink>
       <w:r>
@@ -295,7 +295,7 @@
             <w:sz w:val="15"/>
             <w:u w:val="single"/>
           </w:rPr>
-          <w:t>first-close measurement</w:t>
+          <w:t>earlier-era replay</w:t>
         </w:r>
       </w:hyperlink>
       <w:r>
@@ -421,6 +421,48 @@
             <w:sz w:val="15"/>
             <w:u w:val="single"/>
           </w:rPr>
+          <w:t>mathematical technical note</w:t>
+        </w:r>
+      </w:hyperlink>
+      <w:r>
+        <w:rPr>
+          <w:rFonts w:ascii="Times New Roman" w:hAnsi="Times New Roman" w:eastAsia="Times New Roman"/>
+          <w:b w:val="0"/>
+          <w:i w:val="0"/>
+          <w:color w:val="5F6368"/>
+          <w:sz w:val="15"/>
+        </w:rPr>
+        <w:t xml:space="preserve">, </w:t>
+      </w:r>
+      <w:hyperlink r:id="rId22">
+        <w:r>
+          <w:rPr>
+            <w:rFonts w:ascii="Times New Roman" w:hAnsi="Times New Roman"/>
+            <w:color w:val="1F5A4C"/>
+            <w:sz w:val="15"/>
+            <w:u w:val="single"/>
+          </w:rPr>
+          <w:t>engineering appendix</w:t>
+        </w:r>
+      </w:hyperlink>
+      <w:r>
+        <w:rPr>
+          <w:rFonts w:ascii="Times New Roman" w:hAnsi="Times New Roman" w:eastAsia="Times New Roman"/>
+          <w:b w:val="0"/>
+          <w:i w:val="0"/>
+          <w:color w:val="5F6368"/>
+          <w:sz w:val="15"/>
+        </w:rPr>
+        <w:t xml:space="preserve">, </w:t>
+      </w:r>
+      <w:hyperlink r:id="rId23">
+        <w:r>
+          <w:rPr>
+            <w:rFonts w:ascii="Times New Roman" w:hAnsi="Times New Roman"/>
+            <w:color w:val="1F5A4C"/>
+            <w:sz w:val="15"/>
+            <w:u w:val="single"/>
+          </w:rPr>
           <w:t>demo video</w:t>
         </w:r>
       </w:hyperlink>
@@ -434,7 +476,7 @@
         </w:rPr>
         <w:t xml:space="preserve">, and </w:t>
       </w:r>
-      <w:hyperlink r:id="rId22">
+      <w:hyperlink r:id="rId24">
         <w:r>
           <w:rPr>
             <w:rFonts w:ascii="Times New Roman" w:hAnsi="Times New Roman"/>

</xml_diff>

<commit_message>
Make one-page brief explicit on AI risk and Alpaca
</commit_message>
<xml_diff>
--- a/public/judge/Finly_Judge_Proposal.docx
+++ b/public/judge/Finly_Judge_Proposal.docx
@@ -83,12 +83,22 @@
       <w:r>
         <w:rPr>
           <w:rFonts w:ascii="Times New Roman" w:hAnsi="Times New Roman" w:eastAsia="Times New Roman"/>
+          <w:b/>
+          <w:i w:val="0"/>
+          <w:color w:val="171717"/>
+          <w:sz w:val="20"/>
+        </w:rPr>
+        <w:t>Alpaca infrastructure.</w:t>
+      </w:r>
+      <w:r>
+        <w:rPr>
+          <w:rFonts w:ascii="Times New Roman" w:hAnsi="Times New Roman" w:eastAsia="Times New Roman"/>
           <w:b w:val="0"/>
           <w:i w:val="0"/>
           <w:color w:val="171717"/>
           <w:sz w:val="20"/>
         </w:rPr>
-        <w:t>The answer was then tested in deployment. Finly is a paper-trading bot that lets AI study the market without giving it control of the account. Paper trading follows real prices with virtual money. Through the September 2 close, Finly gained $141.24 in its dedicated $100,000 Alpaca paper account while SPY lost $284.76 from the same starting point. Finly therefore finished $426.00 ahead at the same 4:00 p.m. timestamp. Alpaca recorded fifteen ETF fill events as the allocation was assembled, with no deposits, withdrawals, or options held at that close [1]. The live window is short, but it shows that Finly moved from a historical research result to a running system with a score judges can inspect.</w:t>
+        <w:t xml:space="preserve"> Finly is deployed from a pinned GitHub Actions revision against a dedicated $100,000 Alpaca paper account, with credentials stored as repository secrets so the runner does not depend on the developer's laptop. Through Alpaca's official MCP server and Trading API, it reads the market clock, account, option contracts, positions, orders, and fills. A permitted plan is saved before mutation under a deterministic client order ID; success requires the broker acknowledgement and an exact read-back, while scoring runs remain isolated and read-only. Through the September 2 close, Finly gained $141.24 while SPY lost $284.76 from the same starting point, a $426.00 advantage at the same 4:00 p.m. timestamp. Alpaca recorded fifteen ETF fill events with no deposits, withdrawals, or options held at that close [1,3].</w:t>
       </w:r>
     </w:p>
     <w:p>
@@ -102,12 +112,22 @@
       <w:r>
         <w:rPr>
           <w:rFonts w:ascii="Times New Roman" w:hAnsi="Times New Roman" w:eastAsia="Times New Roman"/>
+          <w:b/>
+          <w:i w:val="0"/>
+          <w:color w:val="171717"/>
+          <w:sz w:val="20"/>
+        </w:rPr>
+        <w:t>AI logic.</w:t>
+      </w:r>
+      <w:r>
+        <w:rPr>
+          <w:rFonts w:ascii="Times New Roman" w:hAnsi="Times New Roman" w:eastAsia="Times New Roman"/>
           <w:b w:val="0"/>
           <w:i w:val="0"/>
           <w:color w:val="171717"/>
           <w:sz w:val="20"/>
         </w:rPr>
-        <w:t>Finly is one autonomous competition strategy with two coordinated sleeves. The four-fund sleeve keeps 48.5 percent in QQQ, which tracks the Nasdaq-100; divides another 48.5 percent among three sector funds with stronger longer-term price trends; and holds 3 percent in cash. The coordinated options sleeve evaluates one small, capped-loss trade tied to SPY. Fresh price momentum decides whether the short-horizon idea is positive or negative; ordinary options-market evidence and Qwen3-32B's reading of public Alpaca news may support that view, weaken it, or stop it. The model cannot choose the contracts, size, loss limit, or broker fields. Fixed code does that work and limits a live entry to exactly one contract and no more than $500 of possible loss, with a tighter 0.5 percent account-risk budget when applicable [2].</w:t>
+        <w:t xml:space="preserve"> Finly is one autonomous competition strategy with two coordinated sleeves. The four-fund sleeve keeps 48.5 percent in QQQ, which tracks the Nasdaq-100; divides another 48.5 percent among three sector funds with stronger longer-term price trends; and holds 3 percent in cash. The options sleeve evaluates one small, capped-loss trade tied to SPY. Fresh price momentum forms the short-horizon view; options-market evidence and Qwen3-32B's reading of public Alpaca news may support it, weaken it, or stop it. The model cannot choose contracts, size, loss limit, or broker fields. Fixed code owns those decisions and limits a live entry to one contract and no more than $500 of possible loss, with a tighter 0.5 percent account-risk budget when applicable [2].</w:t>
       </w:r>
     </w:p>
     <w:p>
@@ -121,12 +141,22 @@
       <w:r>
         <w:rPr>
           <w:rFonts w:ascii="Times New Roman" w:hAnsi="Times New Roman" w:eastAsia="Times New Roman"/>
+          <w:b/>
+          <w:i w:val="0"/>
+          <w:color w:val="171717"/>
+          <w:sz w:val="20"/>
+        </w:rPr>
+        <w:t>Risk gates.</w:t>
+      </w:r>
+      <w:r>
+        <w:rPr>
+          <w:rFonts w:ascii="Times New Roman" w:hAnsi="Times New Roman" w:eastAsia="Times New Roman"/>
           <w:b w:val="0"/>
           <w:i w:val="0"/>
           <w:color w:val="171717"/>
           <w:sz w:val="20"/>
         </w:rPr>
-        <w:t>Every decision by the options sleeve follows the same visible path. Finly records current prices, option quotes, trading activity, and public Alpaca news. Code first asks whether the longer-horizon account remains invested enough to justify a short-horizon options hedge or opportunity. It then builds a bullish call spread, a bearish put spread, or no trade; checks price freshness, liquidity, payoff arithmetic, account capacity, and modeled value; and records how the idea behaves when evidence is removed or inputs are nudged. On September 2 it completed twenty-four live evaluation cycles: fourteen candidates failed certification, six lacked enough model evidence, and four arrived after the entry window. Every cycle ended no trade, so the options sleeve added no new risk [1]. An approved trade would still be bound to one exact order, saved before mutation, and reconciled with Alpaca afterward, preventing a restart from silently duplicating it [3].</w:t>
+        <w:t xml:space="preserve"> Every options decision follows the same visible path. Finly records current prices, option quotes, trading activity, and public Alpaca news. Code builds a bullish call spread, a bearish put spread, or no trade; then checks freshness, liquidity, payoff arithmetic, account capacity, modeled value, evidence removals, and bounded input perturbations. On September 2 it completed twenty-four live evaluation cycles: fourteen candidates failed certification, six lacked enough model evidence, and four arrived after the entry window. Every cycle ended no trade, so the options sleeve added no new risk [1]. Any approved trade remains bound to one exact order and is reconciled with Alpaca afterward, preventing a restart from silently duplicating it [3].</w:t>
       </w:r>
     </w:p>
     <w:p>

</xml_diff>